<commit_message>
implemented spot interruption handling
</commit_message>
<xml_diff>
--- a/Implemented Karpenter on Amazon EKS using EC2NodeClass and NodePools..docx
+++ b/Implemented Karpenter on Amazon EKS using EC2NodeClass and NodePools..docx
@@ -24,17 +24,20 @@
       </w:r>
     </w:p>
     <w:p>
-      <w:pPr>
-        <w:rPr>
-          <w:b/>
-          <w:bCs/>
-        </w:rPr>
-      </w:pPr>
-      <w:r>
-        <w:rPr>
-          <w:b/>
-          <w:bCs/>
-        </w:rPr>
+      <w:r>
+        <w:t>Implemented Karp</w:t>
+      </w:r>
+      <w:proofErr w:type="spellStart"/>
+      <w:r>
+        <w:t>enter</w:t>
+      </w:r>
+      <w:proofErr w:type="spellEnd"/>
+      <w:r>
+        <w:t xml:space="preserve"> autoscaling and validated node lifecycle</w:t>
+      </w:r>
+    </w:p>
+    <w:p>
+      <w:r>
         <w:drawing>
           <wp:inline distT="0" distB="0" distL="0" distR="0" wp14:anchorId="55060C52" wp14:editId="23E09AA3">
             <wp:extent cx="5943600" cy="6362065"/>
@@ -73,17 +76,7 @@
       </w:r>
     </w:p>
     <w:p>
-      <w:pPr>
-        <w:rPr>
-          <w:b/>
-          <w:bCs/>
-        </w:rPr>
-      </w:pPr>
-      <w:r>
-        <w:rPr>
-          <w:b/>
-          <w:bCs/>
-        </w:rPr>
+      <w:r>
         <w:lastRenderedPageBreak/>
         <w:drawing>
           <wp:inline distT="0" distB="0" distL="0" distR="0" wp14:anchorId="3BC1F510" wp14:editId="4BA86942">
@@ -123,17 +116,7 @@
       </w:r>
     </w:p>
     <w:p>
-      <w:pPr>
-        <w:rPr>
-          <w:b/>
-          <w:bCs/>
-        </w:rPr>
-      </w:pPr>
-      <w:r>
-        <w:rPr>
-          <w:b/>
-          <w:bCs/>
-        </w:rPr>
+      <w:r>
         <w:lastRenderedPageBreak/>
         <w:drawing>
           <wp:inline distT="0" distB="0" distL="0" distR="0" wp14:anchorId="4BF6734E" wp14:editId="43D86689">
@@ -173,17 +156,7 @@
       </w:r>
     </w:p>
     <w:p>
-      <w:pPr>
-        <w:rPr>
-          <w:b/>
-          <w:bCs/>
-        </w:rPr>
-      </w:pPr>
-      <w:r>
-        <w:rPr>
-          <w:b/>
-          <w:bCs/>
-        </w:rPr>
+      <w:r>
         <w:drawing>
           <wp:inline distT="0" distB="0" distL="0" distR="0" wp14:anchorId="58A5EA85" wp14:editId="4F857A52">
             <wp:extent cx="5943600" cy="5621655"/>
@@ -219,6 +192,3107 @@
             </a:graphic>
           </wp:inline>
         </w:drawing>
+      </w:r>
+    </w:p>
+    <w:p>
+      <w:r>
+        <w:lastRenderedPageBreak/>
+        <w:t>Administrator@DESKTOP-FCQQ0BG MINGW64 /c/devops4sure520/Stack-Microsvc-K8s_Helm_ArgoCD_GitOps/kubedefs/platform/KARPENTER_k8s-manifests (main)</w:t>
+      </w:r>
+    </w:p>
+    <w:p>
+      <w:r>
+        <w:t>$ ls</w:t>
+      </w:r>
+    </w:p>
+    <w:p>
+      <w:r>
+        <w:t>01_ec2nodeclass.yaml  02_nodepool_ondemand.yaml  03_nodepool_spot.yaml  17_02_Karpenter_On-demand_Instances/  17_03_Karpenter_Spot_Instances/  17_04_Karpenter_Spot_Interruption_Handling/</w:t>
+      </w:r>
+    </w:p>
+    <w:p/>
+    <w:p>
+      <w:r>
+        <w:t>Administrator@DESKTOP-FCQQ0BG MINGW64 /c/devops4sure520/Stack-Microsvc-K8s_Helm_ArgoCD_GitOps/kubedefs/platform/KARPENTER_k8s-manifests (main)</w:t>
+      </w:r>
+    </w:p>
+    <w:p>
+      <w:r>
+        <w:t xml:space="preserve">$ </w:t>
+      </w:r>
+      <w:proofErr w:type="spellStart"/>
+      <w:r>
+        <w:t>kubectl</w:t>
+      </w:r>
+      <w:proofErr w:type="spellEnd"/>
+      <w:r>
+        <w:t xml:space="preserve"> get pods</w:t>
+      </w:r>
+    </w:p>
+    <w:p>
+      <w:r>
+        <w:t>No resources found in default namespace.</w:t>
+      </w:r>
+    </w:p>
+    <w:p/>
+    <w:p>
+      <w:r>
+        <w:t>Administrator@DESKTOP-FCQQ0BG MINGW64 /c/devops4sure520/Stack-Microsvc-K8s_Helm_ArgoCD_GitOps/kubedefs/platform/KARPENTER_k8s-manifests (main)</w:t>
+      </w:r>
+    </w:p>
+    <w:p>
+      <w:r>
+        <w:t xml:space="preserve">$ </w:t>
+      </w:r>
+      <w:proofErr w:type="spellStart"/>
+      <w:r>
+        <w:t>kubectl</w:t>
+      </w:r>
+      <w:proofErr w:type="spellEnd"/>
+      <w:r>
+        <w:t xml:space="preserve"> apply -f 01_ec2nodeclass.yaml</w:t>
+      </w:r>
+    </w:p>
+    <w:p>
+      <w:r>
+        <w:t>ec2nodeclass.karpenter.k8s.aws/default-ec2nodeclass created</w:t>
+      </w:r>
+    </w:p>
+    <w:p/>
+    <w:p>
+      <w:r>
+        <w:t>Administrator@DESKTOP-FCQQ0BG MINGW64 /c/devops4sure520/Stack-Microsvc-K8s_Helm_ArgoCD_GitOps/kubedefs/platform/KARPENTER_k8s-manifests (main)</w:t>
+      </w:r>
+    </w:p>
+    <w:p>
+      <w:r>
+        <w:t xml:space="preserve">$ </w:t>
+      </w:r>
+      <w:proofErr w:type="spellStart"/>
+      <w:r>
+        <w:t>kubectl</w:t>
+      </w:r>
+      <w:proofErr w:type="spellEnd"/>
+      <w:r>
+        <w:t xml:space="preserve"> apply -f 02_nodepool_ondemand.yaml </w:t>
+      </w:r>
+    </w:p>
+    <w:p>
+      <w:r>
+        <w:t>nodepool.karpenter.sh/</w:t>
+      </w:r>
+      <w:proofErr w:type="spellStart"/>
+      <w:r>
+        <w:t>ondemand-nodepool</w:t>
+      </w:r>
+      <w:proofErr w:type="spellEnd"/>
+      <w:r>
+        <w:t xml:space="preserve"> created</w:t>
+      </w:r>
+    </w:p>
+    <w:p/>
+    <w:p>
+      <w:r>
+        <w:t>Administrator@DESKTOP-FCQQ0BG MINGW64 /c/devops4sure520/Stack-Microsvc-K8s_Helm_ArgoCD_GitOps/kubedefs/platform/KARPENTER_k8s-manifests (main)</w:t>
+      </w:r>
+    </w:p>
+    <w:p>
+      <w:r>
+        <w:t xml:space="preserve">$ </w:t>
+      </w:r>
+      <w:proofErr w:type="spellStart"/>
+      <w:r>
+        <w:t>kubectl</w:t>
+      </w:r>
+      <w:proofErr w:type="spellEnd"/>
+      <w:r>
+        <w:t xml:space="preserve"> apply -f 03_nodepool_spot.yaml </w:t>
+      </w:r>
+    </w:p>
+    <w:p>
+      <w:r>
+        <w:t>nodepool.karpenter.sh/spot-</w:t>
+      </w:r>
+      <w:proofErr w:type="spellStart"/>
+      <w:r>
+        <w:t>nodepool</w:t>
+      </w:r>
+      <w:proofErr w:type="spellEnd"/>
+      <w:r>
+        <w:t xml:space="preserve"> created</w:t>
+      </w:r>
+    </w:p>
+    <w:p/>
+    <w:p>
+      <w:r>
+        <w:lastRenderedPageBreak/>
+        <w:t>Administrator@DESKTOP-FCQQ0BG MINGW64 /c/devops4sure520/Stack-Microsvc-K8s_Helm_ArgoCD_GitOps/kubedefs/platform/KARPENTER_k8s-manifests (main)</w:t>
+      </w:r>
+    </w:p>
+    <w:p>
+      <w:r>
+        <w:t xml:space="preserve">$ </w:t>
+      </w:r>
+      <w:proofErr w:type="spellStart"/>
+      <w:r>
+        <w:t>kubectl</w:t>
+      </w:r>
+      <w:proofErr w:type="spellEnd"/>
+      <w:r>
+        <w:t xml:space="preserve"> get nodes</w:t>
+      </w:r>
+    </w:p>
+    <w:p>
+      <w:r>
+        <w:t>NAME                          STATUS   ROLES    AGE   VERSION</w:t>
+      </w:r>
+    </w:p>
+    <w:p>
+      <w:r>
+        <w:t>ip-10-0-10-208.ec2.internal   Ready    &lt;none&gt;   22h   v1.34.8-eks-3385e9b</w:t>
+      </w:r>
+    </w:p>
+    <w:p>
+      <w:r>
+        <w:t>ip-10-0-11-29.ec2.internal    Ready    &lt;none&gt;   22h   v1.34.8-eks-3385e9b</w:t>
+      </w:r>
+    </w:p>
+    <w:p>
+      <w:r>
+        <w:t>ip-10-0-12-184.ec2.internal   Ready    &lt;none&gt;   22h   v1.34.8-eks-3385e9b</w:t>
+      </w:r>
+    </w:p>
+    <w:p/>
+    <w:p>
+      <w:r>
+        <w:t>Administrator@DESKTOP-FCQQ0BG MINGW64 /c/devops4sure520/Stack-Microsvc-K8s_Helm_ArgoCD_GitOps/kubedefs/platform/KARPENTER_k8s-manifests (main)</w:t>
+      </w:r>
+    </w:p>
+    <w:p>
+      <w:r>
+        <w:t xml:space="preserve">$ </w:t>
+      </w:r>
+      <w:proofErr w:type="spellStart"/>
+      <w:r>
+        <w:t>kubectl</w:t>
+      </w:r>
+      <w:proofErr w:type="spellEnd"/>
+      <w:r>
+        <w:t xml:space="preserve"> get </w:t>
+      </w:r>
+      <w:proofErr w:type="spellStart"/>
+      <w:r>
+        <w:t>nodeclaims</w:t>
+      </w:r>
+      <w:proofErr w:type="spellEnd"/>
+    </w:p>
+    <w:p>
+      <w:r>
+        <w:t>No resources found</w:t>
+      </w:r>
+    </w:p>
+    <w:p/>
+    <w:p>
+      <w:r>
+        <w:t>Administrator@DESKTOP-FCQQ0BG MINGW64 /c/devops4sure520/Stack-Microsvc-K8s_Helm_ArgoCD_GitOps/kubedefs/platform/KARPENTER_k8s-manifests (main)</w:t>
+      </w:r>
+    </w:p>
+    <w:p>
+      <w:r>
+        <w:t xml:space="preserve">$ </w:t>
+      </w:r>
+      <w:proofErr w:type="spellStart"/>
+      <w:r>
+        <w:t>kubectl</w:t>
+      </w:r>
+      <w:proofErr w:type="spellEnd"/>
+      <w:r>
+        <w:t xml:space="preserve"> get ec2nodeclass</w:t>
+      </w:r>
+    </w:p>
+    <w:p>
+      <w:r>
+        <w:t>NAME                   READY   AGE</w:t>
+      </w:r>
+    </w:p>
+    <w:p>
+      <w:r>
+        <w:t>default-ec2nodeclass   True    94s</w:t>
+      </w:r>
+    </w:p>
+    <w:p/>
+    <w:p>
+      <w:r>
+        <w:t>Administrator@DESKTOP-FCQQ0BG MINGW64 /c/devops4sure520/Stack-Microsvc-K8s_Helm_ArgoCD_GitOps/kubedefs/platform/KARPENTER_k8s-manifests (main)</w:t>
+      </w:r>
+    </w:p>
+    <w:p>
+      <w:r>
+        <w:t xml:space="preserve">$ </w:t>
+      </w:r>
+      <w:proofErr w:type="spellStart"/>
+      <w:r>
+        <w:t>kubectl</w:t>
+      </w:r>
+      <w:proofErr w:type="spellEnd"/>
+      <w:r>
+        <w:t xml:space="preserve"> describe  ec2nodeclass default-ec2nodeclass</w:t>
+      </w:r>
+    </w:p>
+    <w:p>
+      <w:r>
+        <w:t>Name:         default-ec2nodeclass</w:t>
+      </w:r>
+    </w:p>
+    <w:p>
+      <w:r>
+        <w:t xml:space="preserve">Namespace:    </w:t>
+      </w:r>
+    </w:p>
+    <w:p>
+      <w:r>
+        <w:t>Labels:       &lt;none&gt;</w:t>
+      </w:r>
+    </w:p>
+    <w:p>
+      <w:r>
+        <w:t>Annotations:  karpenter.k8s.aws/ec2nodeclass-hash: 12584748436141608854</w:t>
+      </w:r>
+    </w:p>
+    <w:p>
+      <w:r>
+        <w:t xml:space="preserve">              karpenter.k8s.aws/ec2nodeclass-hash-version: v4</w:t>
+      </w:r>
+    </w:p>
+    <w:p>
+      <w:r>
+        <w:lastRenderedPageBreak/>
+        <w:t>API Version:  karpenter.k8s.aws/v1</w:t>
+      </w:r>
+    </w:p>
+    <w:p>
+      <w:r>
+        <w:t>Kind:         EC2NodeClass</w:t>
+      </w:r>
+    </w:p>
+    <w:p>
+      <w:r>
+        <w:t>Metadata:</w:t>
+      </w:r>
+    </w:p>
+    <w:p>
+      <w:r>
+        <w:t xml:space="preserve">  Creation Timestamp:  2026-05-30T16:23:47Z</w:t>
+      </w:r>
+    </w:p>
+    <w:p>
+      <w:r>
+        <w:t xml:space="preserve">  Finalizers:</w:t>
+      </w:r>
+    </w:p>
+    <w:p>
+      <w:r>
+        <w:t xml:space="preserve">    karpenter.k8s.aws/termination</w:t>
+      </w:r>
+    </w:p>
+    <w:p>
+      <w:r>
+        <w:t xml:space="preserve">  Generation:        1</w:t>
+      </w:r>
+    </w:p>
+    <w:p>
+      <w:r>
+        <w:t xml:space="preserve">  Resource Version:  1846182</w:t>
+      </w:r>
+    </w:p>
+    <w:p>
+      <w:r>
+        <w:t xml:space="preserve">  UID:               4c01fc16-b66a-4e57-970d-e3e82e283660</w:t>
+      </w:r>
+    </w:p>
+    <w:p>
+      <w:r>
+        <w:t>Spec:</w:t>
+      </w:r>
+    </w:p>
+    <w:p>
+      <w:r>
+        <w:t xml:space="preserve">  Ami Family:  AL2023</w:t>
+      </w:r>
+    </w:p>
+    <w:p>
+      <w:r>
+        <w:t xml:space="preserve">  Ami Selector Terms:</w:t>
+      </w:r>
+    </w:p>
+    <w:p>
+      <w:r>
+        <w:t xml:space="preserve">    Alias:  al2023@latest</w:t>
+      </w:r>
+    </w:p>
+    <w:p>
+      <w:r>
+        <w:t xml:space="preserve">  Block Device Mappings:</w:t>
+      </w:r>
+    </w:p>
+    <w:p>
+      <w:r>
+        <w:t xml:space="preserve">    Device Name:  /dev/</w:t>
+      </w:r>
+      <w:proofErr w:type="spellStart"/>
+      <w:r>
+        <w:t>xvda</w:t>
+      </w:r>
+      <w:proofErr w:type="spellEnd"/>
+    </w:p>
+    <w:p>
+      <w:r>
+        <w:t xml:space="preserve">    </w:t>
+      </w:r>
+      <w:proofErr w:type="spellStart"/>
+      <w:r>
+        <w:t>Ebs</w:t>
+      </w:r>
+      <w:proofErr w:type="spellEnd"/>
+      <w:r>
+        <w:t>:</w:t>
+      </w:r>
+    </w:p>
+    <w:p>
+      <w:r>
+        <w:t xml:space="preserve">      Delete On Termination:  true</w:t>
+      </w:r>
+    </w:p>
+    <w:p>
+      <w:r>
+        <w:t xml:space="preserve">      Encrypted:              true</w:t>
+      </w:r>
+    </w:p>
+    <w:p>
+      <w:r>
+        <w:t xml:space="preserve">      Volume Size:            20Gi</w:t>
+      </w:r>
+    </w:p>
+    <w:p>
+      <w:r>
+        <w:t xml:space="preserve">      Volume Type:            gp3</w:t>
+      </w:r>
+    </w:p>
+    <w:p>
+      <w:r>
+        <w:t xml:space="preserve">  Metadata Options:</w:t>
+      </w:r>
+    </w:p>
+    <w:p>
+      <w:r>
+        <w:t xml:space="preserve">    Http Endpoint:                enabled</w:t>
+      </w:r>
+    </w:p>
+    <w:p>
+      <w:r>
+        <w:t xml:space="preserve">    httpProtocolIPv6:             disabled</w:t>
+      </w:r>
+    </w:p>
+    <w:p>
+      <w:r>
+        <w:t xml:space="preserve">    Http Put Response Hop Limit:  2</w:t>
+      </w:r>
+    </w:p>
+    <w:p>
+      <w:r>
+        <w:t xml:space="preserve">    Http Tokens:                  required</w:t>
+      </w:r>
+    </w:p>
+    <w:p>
+      <w:r>
+        <w:t xml:space="preserve">  Role:                           </w:t>
+      </w:r>
+      <w:proofErr w:type="spellStart"/>
+      <w:r>
+        <w:t>arn:aws:iam</w:t>
+      </w:r>
+      <w:proofErr w:type="spellEnd"/>
+      <w:r>
+        <w:t>::788143860357:role/retail-dev-</w:t>
+      </w:r>
+      <w:proofErr w:type="spellStart"/>
+      <w:r>
+        <w:t>karpenter</w:t>
+      </w:r>
+      <w:proofErr w:type="spellEnd"/>
+      <w:r>
+        <w:t>-node-role</w:t>
+      </w:r>
+    </w:p>
+    <w:p>
+      <w:r>
+        <w:lastRenderedPageBreak/>
+        <w:t xml:space="preserve">  Security Group Selector Terms:</w:t>
+      </w:r>
+    </w:p>
+    <w:p>
+      <w:r>
+        <w:t xml:space="preserve">    Tags:</w:t>
+      </w:r>
+    </w:p>
+    <w:p>
+      <w:r>
+        <w:t xml:space="preserve">      kubernetes.io/cluster/retail-dev-platform-</w:t>
+      </w:r>
+      <w:proofErr w:type="spellStart"/>
+      <w:r>
+        <w:t>eks</w:t>
+      </w:r>
+      <w:proofErr w:type="spellEnd"/>
+      <w:r>
+        <w:t>:  owned</w:t>
+      </w:r>
+    </w:p>
+    <w:p>
+      <w:r>
+        <w:t xml:space="preserve">  Subnet Selector Terms:</w:t>
+      </w:r>
+    </w:p>
+    <w:p>
+      <w:r>
+        <w:t xml:space="preserve">    Tags:</w:t>
+      </w:r>
+    </w:p>
+    <w:p>
+      <w:r>
+        <w:t xml:space="preserve">      kubernetes.io/cluster/retail-dev-platform-</w:t>
+      </w:r>
+      <w:proofErr w:type="spellStart"/>
+      <w:r>
+        <w:t>eks</w:t>
+      </w:r>
+      <w:proofErr w:type="spellEnd"/>
+      <w:r>
+        <w:t>:  owned</w:t>
+      </w:r>
+    </w:p>
+    <w:p>
+      <w:r>
+        <w:t xml:space="preserve">      kubernetes.io/role/internal-</w:t>
+      </w:r>
+      <w:proofErr w:type="spellStart"/>
+      <w:r>
+        <w:t>elb</w:t>
+      </w:r>
+      <w:proofErr w:type="spellEnd"/>
+      <w:r>
+        <w:t>:                1</w:t>
+      </w:r>
+    </w:p>
+    <w:p>
+      <w:r>
+        <w:t xml:space="preserve">  Tags:</w:t>
+      </w:r>
+    </w:p>
+    <w:p>
+      <w:r>
+        <w:t xml:space="preserve">    karpenter.sh/discovery:  retail-dev-platform-</w:t>
+      </w:r>
+      <w:proofErr w:type="spellStart"/>
+      <w:r>
+        <w:t>eks</w:t>
+      </w:r>
+      <w:proofErr w:type="spellEnd"/>
+    </w:p>
+    <w:p>
+      <w:r>
+        <w:t>Status:</w:t>
+      </w:r>
+    </w:p>
+    <w:p>
+      <w:r>
+        <w:t xml:space="preserve">  Amis:</w:t>
+      </w:r>
+    </w:p>
+    <w:p>
+      <w:r>
+        <w:t xml:space="preserve">    Id:    ami-02085840809106853</w:t>
+      </w:r>
+    </w:p>
+    <w:p>
+      <w:r>
+        <w:t xml:space="preserve">    Name:  amazon-eks-node-al2023-arm64-nvidia-1.34-v20260527</w:t>
+      </w:r>
+    </w:p>
+    <w:p>
+      <w:r>
+        <w:t xml:space="preserve">    Requirements:</w:t>
+      </w:r>
+    </w:p>
+    <w:p>
+      <w:r>
+        <w:t xml:space="preserve">      Key:       kubernetes.io/arch</w:t>
+      </w:r>
+    </w:p>
+    <w:p>
+      <w:r>
+        <w:t xml:space="preserve">      Operator:  In</w:t>
+      </w:r>
+    </w:p>
+    <w:p>
+      <w:r>
+        <w:t xml:space="preserve">      Values:</w:t>
+      </w:r>
+    </w:p>
+    <w:p>
+      <w:r>
+        <w:t xml:space="preserve">        arm64</w:t>
+      </w:r>
+    </w:p>
+    <w:p>
+      <w:r>
+        <w:t xml:space="preserve">      Key:       karpenter.k8s.aws/instance-</w:t>
+      </w:r>
+      <w:proofErr w:type="spellStart"/>
+      <w:r>
+        <w:t>gpu</w:t>
+      </w:r>
+      <w:proofErr w:type="spellEnd"/>
+      <w:r>
+        <w:t>-count</w:t>
+      </w:r>
+    </w:p>
+    <w:p>
+      <w:r>
+        <w:t xml:space="preserve">      Operator:  Exists</w:t>
+      </w:r>
+    </w:p>
+    <w:p>
+      <w:r>
+        <w:t xml:space="preserve">    Id:          ami-05852713546f96759</w:t>
+      </w:r>
+    </w:p>
+    <w:p>
+      <w:r>
+        <w:t xml:space="preserve">    Name:        amazon-eks-node-al2023-x86_64-neuron-1.34-v20260527</w:t>
+      </w:r>
+    </w:p>
+    <w:p>
+      <w:r>
+        <w:t xml:space="preserve">    Requirements:</w:t>
+      </w:r>
+    </w:p>
+    <w:p>
+      <w:r>
+        <w:t xml:space="preserve">      Key:       kubernetes.io/arch</w:t>
+      </w:r>
+    </w:p>
+    <w:p>
+      <w:r>
+        <w:t xml:space="preserve">      Operator:  In</w:t>
+      </w:r>
+    </w:p>
+    <w:p>
+      <w:r>
+        <w:t xml:space="preserve">      Values:</w:t>
+      </w:r>
+    </w:p>
+    <w:p>
+      <w:r>
+        <w:lastRenderedPageBreak/>
+        <w:t xml:space="preserve">        amd64</w:t>
+      </w:r>
+    </w:p>
+    <w:p>
+      <w:r>
+        <w:t xml:space="preserve">      Key:       karpenter.k8s.aws/instance-accelerator-count</w:t>
+      </w:r>
+    </w:p>
+    <w:p>
+      <w:r>
+        <w:t xml:space="preserve">      Operator:  Exists</w:t>
+      </w:r>
+    </w:p>
+    <w:p>
+      <w:r>
+        <w:t xml:space="preserve">    Id:          ami-0968093d565e4a7b6</w:t>
+      </w:r>
+    </w:p>
+    <w:p>
+      <w:r>
+        <w:t xml:space="preserve">    Name:        amazon-eks-node-al2023-x86_64-nvidia-1.34-v20260527</w:t>
+      </w:r>
+    </w:p>
+    <w:p>
+      <w:r>
+        <w:t xml:space="preserve">    Requirements:</w:t>
+      </w:r>
+    </w:p>
+    <w:p>
+      <w:r>
+        <w:t xml:space="preserve">      Key:       kubernetes.io/arch</w:t>
+      </w:r>
+    </w:p>
+    <w:p>
+      <w:r>
+        <w:t xml:space="preserve">      Operator:  In</w:t>
+      </w:r>
+    </w:p>
+    <w:p>
+      <w:r>
+        <w:t xml:space="preserve">      Values:</w:t>
+      </w:r>
+    </w:p>
+    <w:p>
+      <w:r>
+        <w:t xml:space="preserve">        amd64</w:t>
+      </w:r>
+    </w:p>
+    <w:p>
+      <w:r>
+        <w:t xml:space="preserve">      Key:       karpenter.k8s.aws/instance-</w:t>
+      </w:r>
+      <w:proofErr w:type="spellStart"/>
+      <w:r>
+        <w:t>gpu</w:t>
+      </w:r>
+      <w:proofErr w:type="spellEnd"/>
+      <w:r>
+        <w:t>-count</w:t>
+      </w:r>
+    </w:p>
+    <w:p>
+      <w:r>
+        <w:t xml:space="preserve">      Operator:  Exists</w:t>
+      </w:r>
+    </w:p>
+    <w:p>
+      <w:r>
+        <w:t xml:space="preserve">    Id:          ami-03edb027ad1105d55</w:t>
+      </w:r>
+    </w:p>
+    <w:p>
+      <w:r>
+        <w:t xml:space="preserve">    Name:        amazon-eks-node-al2023-arm64-standard-1.34-v20260527</w:t>
+      </w:r>
+    </w:p>
+    <w:p>
+      <w:r>
+        <w:t xml:space="preserve">    Requirements:</w:t>
+      </w:r>
+    </w:p>
+    <w:p>
+      <w:r>
+        <w:t xml:space="preserve">      Key:       kubernetes.io/arch</w:t>
+      </w:r>
+    </w:p>
+    <w:p>
+      <w:r>
+        <w:t xml:space="preserve">      Operator:  In</w:t>
+      </w:r>
+    </w:p>
+    <w:p>
+      <w:r>
+        <w:t xml:space="preserve">      Values:</w:t>
+      </w:r>
+    </w:p>
+    <w:p>
+      <w:r>
+        <w:t xml:space="preserve">        arm64</w:t>
+      </w:r>
+    </w:p>
+    <w:p>
+      <w:r>
+        <w:t xml:space="preserve">      Key:       karpenter.k8s.aws/instance-</w:t>
+      </w:r>
+      <w:proofErr w:type="spellStart"/>
+      <w:r>
+        <w:t>gpu</w:t>
+      </w:r>
+      <w:proofErr w:type="spellEnd"/>
+      <w:r>
+        <w:t>-count</w:t>
+      </w:r>
+    </w:p>
+    <w:p>
+      <w:r>
+        <w:t xml:space="preserve">      Operator:  </w:t>
+      </w:r>
+      <w:proofErr w:type="spellStart"/>
+      <w:r>
+        <w:t>DoesNotExist</w:t>
+      </w:r>
+      <w:proofErr w:type="spellEnd"/>
+    </w:p>
+    <w:p>
+      <w:r>
+        <w:t xml:space="preserve">      Key:       karpenter.k8s.aws/instance-accelerator-count</w:t>
+      </w:r>
+    </w:p>
+    <w:p>
+      <w:r>
+        <w:t xml:space="preserve">      Operator:  </w:t>
+      </w:r>
+      <w:proofErr w:type="spellStart"/>
+      <w:r>
+        <w:t>DoesNotExist</w:t>
+      </w:r>
+      <w:proofErr w:type="spellEnd"/>
+    </w:p>
+    <w:p>
+      <w:r>
+        <w:t xml:space="preserve">    Id:          ami-08b85019512f9b727</w:t>
+      </w:r>
+    </w:p>
+    <w:p>
+      <w:r>
+        <w:t xml:space="preserve">    Name:        amazon-eks-node-al2023-x86_64-standard-1.34-v20260527</w:t>
+      </w:r>
+    </w:p>
+    <w:p>
+      <w:r>
+        <w:t xml:space="preserve">    Requirements:</w:t>
+      </w:r>
+    </w:p>
+    <w:p>
+      <w:r>
+        <w:lastRenderedPageBreak/>
+        <w:t xml:space="preserve">      Key:       kubernetes.io/arch</w:t>
+      </w:r>
+    </w:p>
+    <w:p>
+      <w:r>
+        <w:t xml:space="preserve">      Operator:  In</w:t>
+      </w:r>
+    </w:p>
+    <w:p>
+      <w:r>
+        <w:t xml:space="preserve">      Values:</w:t>
+      </w:r>
+    </w:p>
+    <w:p>
+      <w:r>
+        <w:t xml:space="preserve">        amd64</w:t>
+      </w:r>
+    </w:p>
+    <w:p>
+      <w:r>
+        <w:t xml:space="preserve">      Key:       karpenter.k8s.aws/instance-</w:t>
+      </w:r>
+      <w:proofErr w:type="spellStart"/>
+      <w:r>
+        <w:t>gpu</w:t>
+      </w:r>
+      <w:proofErr w:type="spellEnd"/>
+      <w:r>
+        <w:t>-count</w:t>
+      </w:r>
+    </w:p>
+    <w:p>
+      <w:r>
+        <w:t xml:space="preserve">      Operator:  </w:t>
+      </w:r>
+      <w:proofErr w:type="spellStart"/>
+      <w:r>
+        <w:t>DoesNotExist</w:t>
+      </w:r>
+      <w:proofErr w:type="spellEnd"/>
+    </w:p>
+    <w:p>
+      <w:r>
+        <w:t xml:space="preserve">      Key:       karpenter.k8s.aws/instance-accelerator-count</w:t>
+      </w:r>
+    </w:p>
+    <w:p>
+      <w:r>
+        <w:t xml:space="preserve">      Operator:  </w:t>
+      </w:r>
+      <w:proofErr w:type="spellStart"/>
+      <w:r>
+        <w:t>DoesNotExist</w:t>
+      </w:r>
+      <w:proofErr w:type="spellEnd"/>
+    </w:p>
+    <w:p>
+      <w:r>
+        <w:t xml:space="preserve">  Conditions:</w:t>
+      </w:r>
+    </w:p>
+    <w:p>
+      <w:r>
+        <w:t xml:space="preserve">    Last Transition Time:  2026-05-30T16:23:48Z</w:t>
+      </w:r>
+    </w:p>
+    <w:p>
+      <w:r>
+        <w:t xml:space="preserve">    Message:               </w:t>
+      </w:r>
+    </w:p>
+    <w:p>
+      <w:r>
+        <w:t xml:space="preserve">    Observed Generation:   1</w:t>
+      </w:r>
+    </w:p>
+    <w:p>
+      <w:r>
+        <w:t xml:space="preserve">    Reason:                </w:t>
+      </w:r>
+      <w:proofErr w:type="spellStart"/>
+      <w:r>
+        <w:t>AMIsReady</w:t>
+      </w:r>
+      <w:proofErr w:type="spellEnd"/>
+    </w:p>
+    <w:p>
+      <w:r>
+        <w:t xml:space="preserve">    Status:                True</w:t>
+      </w:r>
+    </w:p>
+    <w:p>
+      <w:r>
+        <w:t xml:space="preserve">    Type:                  </w:t>
+      </w:r>
+      <w:proofErr w:type="spellStart"/>
+      <w:r>
+        <w:t>AMIsReady</w:t>
+      </w:r>
+      <w:proofErr w:type="spellEnd"/>
+    </w:p>
+    <w:p>
+      <w:r>
+        <w:t xml:space="preserve">    Last Transition Time:  2026-05-30T16:23:48Z</w:t>
+      </w:r>
+    </w:p>
+    <w:p>
+      <w:r>
+        <w:t xml:space="preserve">    Message:               </w:t>
+      </w:r>
+    </w:p>
+    <w:p>
+      <w:r>
+        <w:t xml:space="preserve">    Observed Generation:   1</w:t>
+      </w:r>
+    </w:p>
+    <w:p>
+      <w:r>
+        <w:t xml:space="preserve">    Reason:                </w:t>
+      </w:r>
+      <w:proofErr w:type="spellStart"/>
+      <w:r>
+        <w:t>CapacityReservationsReady</w:t>
+      </w:r>
+      <w:proofErr w:type="spellEnd"/>
+    </w:p>
+    <w:p>
+      <w:r>
+        <w:t xml:space="preserve">    Status:                True</w:t>
+      </w:r>
+    </w:p>
+    <w:p>
+      <w:r>
+        <w:t xml:space="preserve">    Type:                  </w:t>
+      </w:r>
+      <w:proofErr w:type="spellStart"/>
+      <w:r>
+        <w:t>CapacityReservationsReady</w:t>
+      </w:r>
+      <w:proofErr w:type="spellEnd"/>
+    </w:p>
+    <w:p>
+      <w:r>
+        <w:t xml:space="preserve">    Last Transition Time:  2026-05-30T16:23:48Z</w:t>
+      </w:r>
+    </w:p>
+    <w:p>
+      <w:r>
+        <w:t xml:space="preserve">    Message:               </w:t>
+      </w:r>
+    </w:p>
+    <w:p>
+      <w:r>
+        <w:t xml:space="preserve">    Observed Generation:   1</w:t>
+      </w:r>
+    </w:p>
+    <w:p>
+      <w:r>
+        <w:t xml:space="preserve">    Reason:                </w:t>
+      </w:r>
+      <w:proofErr w:type="spellStart"/>
+      <w:r>
+        <w:t>SubnetsReady</w:t>
+      </w:r>
+      <w:proofErr w:type="spellEnd"/>
+    </w:p>
+    <w:p>
+      <w:r>
+        <w:t xml:space="preserve">    Status:                True</w:t>
+      </w:r>
+    </w:p>
+    <w:p>
+      <w:r>
+        <w:lastRenderedPageBreak/>
+        <w:t xml:space="preserve">    Type:                  </w:t>
+      </w:r>
+      <w:proofErr w:type="spellStart"/>
+      <w:r>
+        <w:t>SubnetsReady</w:t>
+      </w:r>
+      <w:proofErr w:type="spellEnd"/>
+    </w:p>
+    <w:p>
+      <w:r>
+        <w:t xml:space="preserve">    Last Transition Time:  2026-05-30T16:23:48Z</w:t>
+      </w:r>
+    </w:p>
+    <w:p>
+      <w:r>
+        <w:t xml:space="preserve">    Message:               </w:t>
+      </w:r>
+    </w:p>
+    <w:p>
+      <w:r>
+        <w:t xml:space="preserve">    Observed Generation:   1</w:t>
+      </w:r>
+    </w:p>
+    <w:p>
+      <w:r>
+        <w:t xml:space="preserve">    Reason:                </w:t>
+      </w:r>
+      <w:proofErr w:type="spellStart"/>
+      <w:r>
+        <w:t>SecurityGroupsReady</w:t>
+      </w:r>
+      <w:proofErr w:type="spellEnd"/>
+    </w:p>
+    <w:p>
+      <w:r>
+        <w:t xml:space="preserve">    Status:                True</w:t>
+      </w:r>
+    </w:p>
+    <w:p>
+      <w:r>
+        <w:t xml:space="preserve">    Type:                  </w:t>
+      </w:r>
+      <w:proofErr w:type="spellStart"/>
+      <w:r>
+        <w:t>SecurityGroupsReady</w:t>
+      </w:r>
+      <w:proofErr w:type="spellEnd"/>
+    </w:p>
+    <w:p>
+      <w:r>
+        <w:t xml:space="preserve">    Last Transition Time:  2026-05-30T16:23:48Z</w:t>
+      </w:r>
+    </w:p>
+    <w:p>
+      <w:r>
+        <w:t xml:space="preserve">    Message:               </w:t>
+      </w:r>
+    </w:p>
+    <w:p>
+      <w:r>
+        <w:t xml:space="preserve">    Observed Generation:   1</w:t>
+      </w:r>
+    </w:p>
+    <w:p>
+      <w:r>
+        <w:t xml:space="preserve">    Reason:                </w:t>
+      </w:r>
+      <w:proofErr w:type="spellStart"/>
+      <w:r>
+        <w:t>InstanceProfileReady</w:t>
+      </w:r>
+      <w:proofErr w:type="spellEnd"/>
+    </w:p>
+    <w:p>
+      <w:r>
+        <w:t xml:space="preserve">    Status:                True</w:t>
+      </w:r>
+    </w:p>
+    <w:p>
+      <w:r>
+        <w:t xml:space="preserve">    Type:                  </w:t>
+      </w:r>
+      <w:proofErr w:type="spellStart"/>
+      <w:r>
+        <w:t>InstanceProfileReady</w:t>
+      </w:r>
+      <w:proofErr w:type="spellEnd"/>
+    </w:p>
+    <w:p>
+      <w:r>
+        <w:t xml:space="preserve">    Last Transition Time:  2026-05-30T16:23:55Z</w:t>
+      </w:r>
+    </w:p>
+    <w:p>
+      <w:r>
+        <w:t xml:space="preserve">    Message:               </w:t>
+      </w:r>
+    </w:p>
+    <w:p>
+      <w:r>
+        <w:t xml:space="preserve">    Observed Generation:   1</w:t>
+      </w:r>
+    </w:p>
+    <w:p>
+      <w:r>
+        <w:t xml:space="preserve">    Reason:                </w:t>
+      </w:r>
+      <w:proofErr w:type="spellStart"/>
+      <w:r>
+        <w:t>ValidationSucceeded</w:t>
+      </w:r>
+      <w:proofErr w:type="spellEnd"/>
+    </w:p>
+    <w:p>
+      <w:r>
+        <w:t xml:space="preserve">    Status:                True</w:t>
+      </w:r>
+    </w:p>
+    <w:p>
+      <w:r>
+        <w:t xml:space="preserve">    Type:                  </w:t>
+      </w:r>
+      <w:proofErr w:type="spellStart"/>
+      <w:r>
+        <w:t>ValidationSucceeded</w:t>
+      </w:r>
+      <w:proofErr w:type="spellEnd"/>
+    </w:p>
+    <w:p>
+      <w:r>
+        <w:t xml:space="preserve">    Last Transition Time:  2026-05-30T16:23:55Z</w:t>
+      </w:r>
+    </w:p>
+    <w:p>
+      <w:r>
+        <w:t xml:space="preserve">    Message:               </w:t>
+      </w:r>
+    </w:p>
+    <w:p>
+      <w:r>
+        <w:t xml:space="preserve">    Observed Generation:   1</w:t>
+      </w:r>
+    </w:p>
+    <w:p>
+      <w:r>
+        <w:t xml:space="preserve">    Reason:                Ready</w:t>
+      </w:r>
+    </w:p>
+    <w:p>
+      <w:r>
+        <w:t xml:space="preserve">    Status:                True</w:t>
+      </w:r>
+    </w:p>
+    <w:p>
+      <w:r>
+        <w:t xml:space="preserve">    Type:                  Ready</w:t>
+      </w:r>
+    </w:p>
+    <w:p>
+      <w:r>
+        <w:t xml:space="preserve">  Instance Profile:        retail-dev-platform-eks_11040119419547027872</w:t>
+      </w:r>
+    </w:p>
+    <w:p>
+      <w:r>
+        <w:lastRenderedPageBreak/>
+        <w:t xml:space="preserve">  Security Groups:</w:t>
+      </w:r>
+    </w:p>
+    <w:p>
+      <w:r>
+        <w:t xml:space="preserve">    Id:    sg-014156d93a8007372</w:t>
+      </w:r>
+    </w:p>
+    <w:p>
+      <w:r>
+        <w:t xml:space="preserve">    Name:  eks-cluster-sg-retail-dev-platform-eks-1345947019</w:t>
+      </w:r>
+    </w:p>
+    <w:p>
+      <w:r>
+        <w:t xml:space="preserve">  Subnets:</w:t>
+      </w:r>
+    </w:p>
+    <w:p>
+      <w:r>
+        <w:t xml:space="preserve">    Id:       subnet-0cf4f2754bb68b963</w:t>
+      </w:r>
+    </w:p>
+    <w:p>
+      <w:r>
+        <w:t xml:space="preserve">    Zone:     us-east-1a</w:t>
+      </w:r>
+    </w:p>
+    <w:p>
+      <w:r>
+        <w:t xml:space="preserve">    Zone ID:  use1-az1</w:t>
+      </w:r>
+    </w:p>
+    <w:p>
+      <w:r>
+        <w:t xml:space="preserve">    Id:       subnet-0b953a2b8de791a45</w:t>
+      </w:r>
+    </w:p>
+    <w:p>
+      <w:r>
+        <w:t xml:space="preserve">    Zone:     us-east-1c</w:t>
+      </w:r>
+    </w:p>
+    <w:p>
+      <w:r>
+        <w:t xml:space="preserve">    Zone ID:  use1-az4</w:t>
+      </w:r>
+    </w:p>
+    <w:p>
+      <w:r>
+        <w:t xml:space="preserve">    Id:       subnet-0c0bdbf4b6ee51855</w:t>
+      </w:r>
+    </w:p>
+    <w:p>
+      <w:r>
+        <w:t xml:space="preserve">    Zone:     us-east-1b</w:t>
+      </w:r>
+    </w:p>
+    <w:p>
+      <w:r>
+        <w:t xml:space="preserve">    Zone ID:  use1-az2</w:t>
+      </w:r>
+    </w:p>
+    <w:p>
+      <w:r>
+        <w:t>Events:</w:t>
+      </w:r>
+    </w:p>
+    <w:p>
+      <w:r>
+        <w:t xml:space="preserve">  Type    Reason                     Age    From       Message</w:t>
+      </w:r>
+    </w:p>
+    <w:p>
+      <w:r>
+        <w:t xml:space="preserve">  ----    ------                     ----   ----       -------</w:t>
+      </w:r>
+    </w:p>
+    <w:p>
+      <w:r>
+        <w:t xml:space="preserve">  Normal  </w:t>
+      </w:r>
+      <w:proofErr w:type="spellStart"/>
+      <w:r>
+        <w:t>AMIsReady</w:t>
+      </w:r>
+      <w:proofErr w:type="spellEnd"/>
+      <w:r>
+        <w:t xml:space="preserve">                  2m11s  </w:t>
+      </w:r>
+      <w:proofErr w:type="spellStart"/>
+      <w:r>
+        <w:t>karpenter</w:t>
+      </w:r>
+      <w:proofErr w:type="spellEnd"/>
+      <w:r>
+        <w:t xml:space="preserve">  Status condition transitioned, Type: </w:t>
+      </w:r>
+      <w:proofErr w:type="spellStart"/>
+      <w:r>
+        <w:t>AMIsReady</w:t>
+      </w:r>
+      <w:proofErr w:type="spellEnd"/>
+      <w:r>
+        <w:t xml:space="preserve">, Status: Unknown -&gt; True, Reason: </w:t>
+      </w:r>
+      <w:proofErr w:type="spellStart"/>
+      <w:r>
+        <w:t>AMIsReady</w:t>
+      </w:r>
+      <w:proofErr w:type="spellEnd"/>
+    </w:p>
+    <w:p>
+      <w:r>
+        <w:t xml:space="preserve">  Normal  </w:t>
+      </w:r>
+      <w:proofErr w:type="spellStart"/>
+      <w:r>
+        <w:t>CapacityReservationsReady</w:t>
+      </w:r>
+      <w:proofErr w:type="spellEnd"/>
+      <w:r>
+        <w:t xml:space="preserve">  2m11s  </w:t>
+      </w:r>
+      <w:proofErr w:type="spellStart"/>
+      <w:r>
+        <w:t>karpenter</w:t>
+      </w:r>
+      <w:proofErr w:type="spellEnd"/>
+      <w:r>
+        <w:t xml:space="preserve">  Status condition transitioned, Type: </w:t>
+      </w:r>
+      <w:proofErr w:type="spellStart"/>
+      <w:r>
+        <w:t>CapacityReservationsReady</w:t>
+      </w:r>
+      <w:proofErr w:type="spellEnd"/>
+      <w:r>
+        <w:t xml:space="preserve">, Status: Unknown -&gt; True, Reason: </w:t>
+      </w:r>
+      <w:proofErr w:type="spellStart"/>
+      <w:r>
+        <w:t>CapacityReservationsReady</w:t>
+      </w:r>
+      <w:proofErr w:type="spellEnd"/>
+    </w:p>
+    <w:p>
+      <w:r>
+        <w:t xml:space="preserve">  Normal  </w:t>
+      </w:r>
+      <w:proofErr w:type="spellStart"/>
+      <w:r>
+        <w:t>SubnetsReady</w:t>
+      </w:r>
+      <w:proofErr w:type="spellEnd"/>
+      <w:r>
+        <w:t xml:space="preserve">               2m11s  </w:t>
+      </w:r>
+      <w:proofErr w:type="spellStart"/>
+      <w:r>
+        <w:t>karpenter</w:t>
+      </w:r>
+      <w:proofErr w:type="spellEnd"/>
+      <w:r>
+        <w:t xml:space="preserve">  Status condition transitioned, Type: </w:t>
+      </w:r>
+      <w:proofErr w:type="spellStart"/>
+      <w:r>
+        <w:t>SubnetsReady</w:t>
+      </w:r>
+      <w:proofErr w:type="spellEnd"/>
+      <w:r>
+        <w:t xml:space="preserve">, Status: Unknown -&gt; True, Reason: </w:t>
+      </w:r>
+      <w:proofErr w:type="spellStart"/>
+      <w:r>
+        <w:t>SubnetsReady</w:t>
+      </w:r>
+      <w:proofErr w:type="spellEnd"/>
+    </w:p>
+    <w:p>
+      <w:r>
+        <w:t xml:space="preserve">  Normal  </w:t>
+      </w:r>
+      <w:proofErr w:type="spellStart"/>
+      <w:r>
+        <w:t>SecurityGroupsReady</w:t>
+      </w:r>
+      <w:proofErr w:type="spellEnd"/>
+      <w:r>
+        <w:t xml:space="preserve">        2m11s  </w:t>
+      </w:r>
+      <w:proofErr w:type="spellStart"/>
+      <w:r>
+        <w:t>karpenter</w:t>
+      </w:r>
+      <w:proofErr w:type="spellEnd"/>
+      <w:r>
+        <w:t xml:space="preserve">  Status condition transitioned, Type: </w:t>
+      </w:r>
+      <w:proofErr w:type="spellStart"/>
+      <w:r>
+        <w:t>SecurityGroupsReady</w:t>
+      </w:r>
+      <w:proofErr w:type="spellEnd"/>
+      <w:r>
+        <w:t xml:space="preserve">, Status: Unknown -&gt; True, Reason: </w:t>
+      </w:r>
+      <w:proofErr w:type="spellStart"/>
+      <w:r>
+        <w:t>SecurityGroupsReady</w:t>
+      </w:r>
+      <w:proofErr w:type="spellEnd"/>
+    </w:p>
+    <w:p>
+      <w:r>
+        <w:t xml:space="preserve">  Normal  </w:t>
+      </w:r>
+      <w:proofErr w:type="spellStart"/>
+      <w:r>
+        <w:t>InstanceProfileReady</w:t>
+      </w:r>
+      <w:proofErr w:type="spellEnd"/>
+      <w:r>
+        <w:t xml:space="preserve">       2m11s  </w:t>
+      </w:r>
+      <w:proofErr w:type="spellStart"/>
+      <w:r>
+        <w:t>karpenter</w:t>
+      </w:r>
+      <w:proofErr w:type="spellEnd"/>
+      <w:r>
+        <w:t xml:space="preserve">  Status condition transitioned, Type: </w:t>
+      </w:r>
+      <w:proofErr w:type="spellStart"/>
+      <w:r>
+        <w:t>InstanceProfileReady</w:t>
+      </w:r>
+      <w:proofErr w:type="spellEnd"/>
+      <w:r>
+        <w:t xml:space="preserve">, Status: Unknown -&gt; True, Reason: </w:t>
+      </w:r>
+      <w:proofErr w:type="spellStart"/>
+      <w:r>
+        <w:t>InstanceProfileReady</w:t>
+      </w:r>
+      <w:proofErr w:type="spellEnd"/>
+    </w:p>
+    <w:p>
+      <w:r>
+        <w:lastRenderedPageBreak/>
+        <w:t xml:space="preserve">  Normal  </w:t>
+      </w:r>
+      <w:proofErr w:type="spellStart"/>
+      <w:r>
+        <w:t>ValidationSucceeded</w:t>
+      </w:r>
+      <w:proofErr w:type="spellEnd"/>
+      <w:r>
+        <w:t xml:space="preserve">        2m5s   </w:t>
+      </w:r>
+      <w:proofErr w:type="spellStart"/>
+      <w:r>
+        <w:t>karpenter</w:t>
+      </w:r>
+      <w:proofErr w:type="spellEnd"/>
+      <w:r>
+        <w:t xml:space="preserve">  Status condition transitioned, Type: </w:t>
+      </w:r>
+      <w:proofErr w:type="spellStart"/>
+      <w:r>
+        <w:t>ValidationSucceeded</w:t>
+      </w:r>
+      <w:proofErr w:type="spellEnd"/>
+      <w:r>
+        <w:t xml:space="preserve">, Status: Unknown -&gt; True, Reason: </w:t>
+      </w:r>
+      <w:proofErr w:type="spellStart"/>
+      <w:r>
+        <w:t>ValidationSucceeded</w:t>
+      </w:r>
+      <w:proofErr w:type="spellEnd"/>
+    </w:p>
+    <w:p>
+      <w:r>
+        <w:t xml:space="preserve">  Normal  Ready                      2m5s   </w:t>
+      </w:r>
+      <w:proofErr w:type="spellStart"/>
+      <w:r>
+        <w:t>karpenter</w:t>
+      </w:r>
+      <w:proofErr w:type="spellEnd"/>
+      <w:r>
+        <w:t xml:space="preserve">  Status condition transitioned, Type: Ready, Status: Unknown -&gt; True, Reason: Ready</w:t>
+      </w:r>
+    </w:p>
+    <w:p/>
+    <w:p>
+      <w:r>
+        <w:t>Administrator@DESKTOP-FCQQ0BG MINGW64 /c/devops4sure520/Stack-Microsvc-K8s_Helm_ArgoCD_GitOps/kubedefs/platform/KARPENTER_k8s-manifests (main)</w:t>
+      </w:r>
+    </w:p>
+    <w:p>
+      <w:r>
+        <w:t xml:space="preserve">$ </w:t>
+      </w:r>
+      <w:proofErr w:type="spellStart"/>
+      <w:r>
+        <w:t>kubectl</w:t>
+      </w:r>
+      <w:proofErr w:type="spellEnd"/>
+      <w:r>
+        <w:t xml:space="preserve"> get </w:t>
+      </w:r>
+      <w:proofErr w:type="spellStart"/>
+      <w:r>
+        <w:t>nodepools</w:t>
+      </w:r>
+      <w:proofErr w:type="spellEnd"/>
+    </w:p>
+    <w:p>
+      <w:r>
+        <w:t>NAME                NODECLASS              NODES   READY   AGE</w:t>
+      </w:r>
+    </w:p>
+    <w:p>
+      <w:proofErr w:type="spellStart"/>
+      <w:r>
+        <w:t>ondemand-nodepool</w:t>
+      </w:r>
+      <w:proofErr w:type="spellEnd"/>
+      <w:r>
+        <w:t xml:space="preserve">   default-ec2nodeclass   0       True    2m56s</w:t>
+      </w:r>
+    </w:p>
+    <w:p>
+      <w:r>
+        <w:t>spot-</w:t>
+      </w:r>
+      <w:proofErr w:type="spellStart"/>
+      <w:r>
+        <w:t>nodepool</w:t>
+      </w:r>
+      <w:proofErr w:type="spellEnd"/>
+      <w:r>
+        <w:t xml:space="preserve">       default-ec2nodeclass   0       True    2m32s</w:t>
+      </w:r>
+    </w:p>
+    <w:p/>
+    <w:p>
+      <w:r>
+        <w:t>Administrator@DESKTOP-FCQQ0BG MINGW64 /c/devops4sure520/Stack-Microsvc-K8s_Helm_ArgoCD_GitOps/kubedefs/platform/KARPENTER_k8s-manifests (main)</w:t>
+      </w:r>
+    </w:p>
+    <w:p>
+      <w:r>
+        <w:t>$ ls</w:t>
+      </w:r>
+    </w:p>
+    <w:p>
+      <w:r>
+        <w:t>01_ec2nodeclass.yaml  02_nodepool_ondemand.yaml  03_nodepool_spot.yaml  17_02_Karpenter_On-demand_Instances/  17_03_Karpenter_Spot_Instances/  17_04_Karpenter_Spot_Interruption_Handling/</w:t>
+      </w:r>
+    </w:p>
+    <w:p/>
+    <w:p>
+      <w:r>
+        <w:t>Administrator@DESKTOP-FCQQ0BG MINGW64 /c/devops4sure520/Stack-Microsvc-K8s_Helm_ArgoCD_GitOps/kubedefs/platform/KARPENTER_k8s-manifests (main)</w:t>
+      </w:r>
+    </w:p>
+    <w:p>
+      <w:r>
+        <w:t>$ cd 17_02_Karpenter_On-demand_Instances/</w:t>
+      </w:r>
+    </w:p>
+    <w:p/>
+    <w:p>
+      <w:r>
+        <w:t>Administrator@DESKTOP-FCQQ0BG MINGW64 /c/devops4sure520/Stack-Microsvc-K8s_Helm_ArgoCD_GitOps/kubedefs/platform/KARPENTER_k8s-manifests/17_02_Karpenter_On-demand_Instances (main)</w:t>
+      </w:r>
+    </w:p>
+    <w:p>
+      <w:r>
+        <w:t>$ ls</w:t>
+      </w:r>
+    </w:p>
+    <w:p>
+      <w:proofErr w:type="spellStart"/>
+      <w:r>
+        <w:t>kube</w:t>
+      </w:r>
+      <w:proofErr w:type="spellEnd"/>
+      <w:r>
+        <w:t>-manifests-On-demand/  README.md</w:t>
+      </w:r>
+    </w:p>
+    <w:p/>
+    <w:p>
+      <w:r>
+        <w:lastRenderedPageBreak/>
+        <w:t>Administrator@DESKTOP-FCQQ0BG MINGW64 /c/devops4sure520/Stack-Microsvc-K8s_Helm_ArgoCD_GitOps/kubedefs/platform/KARPENTER_k8s-manifests/17_02_Karpenter_On-demand_Instances (main)</w:t>
+      </w:r>
+    </w:p>
+    <w:p>
+      <w:r>
+        <w:t xml:space="preserve">$ </w:t>
+      </w:r>
+      <w:proofErr w:type="spellStart"/>
+      <w:r>
+        <w:t>kubectl</w:t>
+      </w:r>
+      <w:proofErr w:type="spellEnd"/>
+      <w:r>
+        <w:t xml:space="preserve"> apply -f </w:t>
+      </w:r>
+      <w:proofErr w:type="spellStart"/>
+      <w:r>
+        <w:t>kube</w:t>
+      </w:r>
+      <w:proofErr w:type="spellEnd"/>
+      <w:r>
+        <w:t>-manifests-On-demand/</w:t>
+      </w:r>
+    </w:p>
+    <w:p>
+      <w:proofErr w:type="spellStart"/>
+      <w:r>
+        <w:t>deployment.apps</w:t>
+      </w:r>
+      <w:proofErr w:type="spellEnd"/>
+      <w:r>
+        <w:t>/</w:t>
+      </w:r>
+      <w:proofErr w:type="spellStart"/>
+      <w:r>
+        <w:t>karpenter</w:t>
+      </w:r>
+      <w:proofErr w:type="spellEnd"/>
+      <w:r>
+        <w:t>-</w:t>
+      </w:r>
+      <w:proofErr w:type="spellStart"/>
+      <w:r>
+        <w:t>autoscale</w:t>
+      </w:r>
+      <w:proofErr w:type="spellEnd"/>
+      <w:r>
+        <w:t>-demo-</w:t>
+      </w:r>
+      <w:proofErr w:type="spellStart"/>
+      <w:r>
+        <w:t>ondemand</w:t>
+      </w:r>
+      <w:proofErr w:type="spellEnd"/>
+      <w:r>
+        <w:t xml:space="preserve"> created</w:t>
+      </w:r>
+    </w:p>
+    <w:p/>
+    <w:p>
+      <w:r>
+        <w:t>Administrator@DESKTOP-FCQQ0BG MINGW64 /c/devops4sure520/Stack-Microsvc-K8s_Helm_ArgoCD_GitOps/kubedefs/platform/KARPENTER_k8s-manifests/17_02_Karpenter_On-demand_Instances (main)</w:t>
+      </w:r>
+    </w:p>
+    <w:p>
+      <w:r>
+        <w:t xml:space="preserve">$ </w:t>
+      </w:r>
+      <w:proofErr w:type="spellStart"/>
+      <w:r>
+        <w:t>kubectl</w:t>
+      </w:r>
+      <w:proofErr w:type="spellEnd"/>
+      <w:r>
+        <w:t xml:space="preserve"> get pods</w:t>
+      </w:r>
+    </w:p>
+    <w:p>
+      <w:r>
+        <w:t>NAME                                                 READY   STATUS    RESTARTS   AGE</w:t>
+      </w:r>
+    </w:p>
+    <w:p>
+      <w:r>
+        <w:t>karpenter-autoscale-demo-ondemand-6bd55b7cdd-8xf9h   0/1     Pending   0          14s</w:t>
+      </w:r>
+    </w:p>
+    <w:p>
+      <w:r>
+        <w:t>karpenter-autoscale-demo-ondemand-6bd55b7cdd-nwn6t   0/1     Pending   0          14s</w:t>
+      </w:r>
+    </w:p>
+    <w:p>
+      <w:r>
+        <w:t>karpenter-autoscale-demo-ondemand-6bd55b7cdd-rlz62   0/1     Pending   0          14s</w:t>
+      </w:r>
+    </w:p>
+    <w:p>
+      <w:r>
+        <w:t>karpenter-autoscale-demo-ondemand-6bd55b7cdd-zn8sv   0/1     Pending   0          14s</w:t>
+      </w:r>
+    </w:p>
+    <w:p>
+      <w:r>
+        <w:t>karpenter-autoscale-demo-ondemand-6bd55b7cdd-ztl96   0/1     Pending   0          14s</w:t>
+      </w:r>
+    </w:p>
+    <w:p/>
+    <w:p>
+      <w:r>
+        <w:t>Administrator@DESKTOP-FCQQ0BG MINGW64 /c/devops4sure520/Stack-Microsvc-K8s_Helm_ArgoCD_GitOps/kubedefs/platform/KARPENTER_k8s-manifests/17_02_Karpenter_On-demand_Instances (main)</w:t>
+      </w:r>
+    </w:p>
+    <w:p>
+      <w:r>
+        <w:t xml:space="preserve">$ </w:t>
+      </w:r>
+      <w:proofErr w:type="spellStart"/>
+      <w:r>
+        <w:t>kubectl</w:t>
+      </w:r>
+      <w:proofErr w:type="spellEnd"/>
+      <w:r>
+        <w:t xml:space="preserve"> get pods</w:t>
+      </w:r>
+    </w:p>
+    <w:p>
+      <w:r>
+        <w:t>NAME                                                 READY   STATUS    RESTARTS   AGE</w:t>
+      </w:r>
+    </w:p>
+    <w:p>
+      <w:r>
+        <w:t>karpenter-autoscale-demo-ondemand-6bd55b7cdd-8xf9h   0/1     Pending   0          25s</w:t>
+      </w:r>
+    </w:p>
+    <w:p>
+      <w:r>
+        <w:t>karpenter-autoscale-demo-ondemand-6bd55b7cdd-nwn6t   0/1     Pending   0          25s</w:t>
+      </w:r>
+    </w:p>
+    <w:p>
+      <w:r>
+        <w:t>karpenter-autoscale-demo-ondemand-6bd55b7cdd-rlz62   0/1     Pending   0          25s</w:t>
+      </w:r>
+    </w:p>
+    <w:p>
+      <w:r>
+        <w:t>karpenter-autoscale-demo-ondemand-6bd55b7cdd-zn8sv   0/1     Pending   0          25s</w:t>
+      </w:r>
+    </w:p>
+    <w:p>
+      <w:r>
+        <w:t>karpenter-autoscale-demo-ondemand-6bd55b7cdd-ztl96   0/1     Pending   0          25s</w:t>
+      </w:r>
+    </w:p>
+    <w:p/>
+    <w:p>
+      <w:r>
+        <w:lastRenderedPageBreak/>
+        <w:t>Administrator@DESKTOP-FCQQ0BG MINGW64 /c/devops4sure520/Stack-Microsvc-K8s_Helm_ArgoCD_GitOps/kubedefs/platform/KARPENTER_k8s-manifests/17_02_Karpenter_On-demand_Instances (main)</w:t>
+      </w:r>
+    </w:p>
+    <w:p>
+      <w:r>
+        <w:t xml:space="preserve">$ </w:t>
+      </w:r>
+      <w:proofErr w:type="spellStart"/>
+      <w:r>
+        <w:t>kubectl</w:t>
+      </w:r>
+      <w:proofErr w:type="spellEnd"/>
+      <w:r>
+        <w:t xml:space="preserve"> get pods</w:t>
+      </w:r>
+    </w:p>
+    <w:p>
+      <w:r>
+        <w:t>NAME                                                 READY   STATUS    RESTARTS   AGE</w:t>
+      </w:r>
+    </w:p>
+    <w:p>
+      <w:r>
+        <w:t>karpenter-autoscale-demo-ondemand-6bd55b7cdd-8xf9h   1/1     Running   0          89s</w:t>
+      </w:r>
+    </w:p>
+    <w:p>
+      <w:r>
+        <w:t>karpenter-autoscale-demo-ondemand-6bd55b7cdd-nwn6t   1/1     Running   0          89s</w:t>
+      </w:r>
+    </w:p>
+    <w:p>
+      <w:r>
+        <w:t>karpenter-autoscale-demo-ondemand-6bd55b7cdd-rlz62   1/1     Running   0          89s</w:t>
+      </w:r>
+    </w:p>
+    <w:p>
+      <w:r>
+        <w:t>karpenter-autoscale-demo-ondemand-6bd55b7cdd-zn8sv   1/1     Running   0          89s</w:t>
+      </w:r>
+    </w:p>
+    <w:p>
+      <w:r>
+        <w:t>karpenter-autoscale-demo-ondemand-6bd55b7cdd-ztl96   1/1     Running   0          89s</w:t>
+      </w:r>
+    </w:p>
+    <w:p/>
+    <w:p>
+      <w:r>
+        <w:t>Administrator@DESKTOP-FCQQ0BG MINGW64 /c/devops4sure520/Stack-Microsvc-K8s_Helm_ArgoCD_GitOps/kubedefs/platform/KARPENTER_k8s-manifests/17_02_Karpenter_On-demand_Instances (main)</w:t>
+      </w:r>
+    </w:p>
+    <w:p>
+      <w:r>
+        <w:t xml:space="preserve">$ </w:t>
+      </w:r>
+      <w:proofErr w:type="spellStart"/>
+      <w:r>
+        <w:t>kubectl</w:t>
+      </w:r>
+      <w:proofErr w:type="spellEnd"/>
+      <w:r>
+        <w:t xml:space="preserve"> get </w:t>
+      </w:r>
+      <w:proofErr w:type="spellStart"/>
+      <w:r>
+        <w:t>nodecliams</w:t>
+      </w:r>
+      <w:proofErr w:type="spellEnd"/>
+    </w:p>
+    <w:p>
+      <w:r>
+        <w:t>error: the server doesn't have a resource type "</w:t>
+      </w:r>
+      <w:proofErr w:type="spellStart"/>
+      <w:r>
+        <w:t>nodecliams</w:t>
+      </w:r>
+      <w:proofErr w:type="spellEnd"/>
+      <w:r>
+        <w:t>"</w:t>
+      </w:r>
+    </w:p>
+    <w:p/>
+    <w:p>
+      <w:r>
+        <w:t>Administrator@DESKTOP-FCQQ0BG MINGW64 /c/devops4sure520/Stack-Microsvc-K8s_Helm_ArgoCD_GitOps/kubedefs/platform/KARPENTER_k8s-manifests/17_02_Karpenter_On-demand_Instances (main)</w:t>
+      </w:r>
+    </w:p>
+    <w:p>
+      <w:r>
+        <w:t xml:space="preserve">$ </w:t>
+      </w:r>
+      <w:proofErr w:type="spellStart"/>
+      <w:r>
+        <w:t>kubectl</w:t>
+      </w:r>
+      <w:proofErr w:type="spellEnd"/>
+      <w:r>
+        <w:t xml:space="preserve"> get </w:t>
+      </w:r>
+      <w:proofErr w:type="spellStart"/>
+      <w:r>
+        <w:t>nodeclaims</w:t>
+      </w:r>
+      <w:proofErr w:type="spellEnd"/>
+    </w:p>
+    <w:p>
+      <w:r>
+        <w:t>NAME                      TYPE        CAPACITY    ZONE         NODE                          READY   AGE</w:t>
+      </w:r>
+    </w:p>
+    <w:p>
+      <w:r>
+        <w:t>ondemand-nodepool-7nnsp   t3.small    on-demand   us-east-1b   ip-10-0-11-168.ec2.internal   True    3m49s</w:t>
+      </w:r>
+    </w:p>
+    <w:p>
+      <w:proofErr w:type="spellStart"/>
+      <w:r>
+        <w:t>ondemand-nodepool-xxffv</w:t>
+      </w:r>
+      <w:proofErr w:type="spellEnd"/>
+      <w:r>
+        <w:t xml:space="preserve">   t3a.small   on-demand   us-east-1a   ip-10-0-10-112.ec2.internal   True    3m49s</w:t>
+      </w:r>
+    </w:p>
+    <w:p/>
+    <w:p>
+      <w:r>
+        <w:lastRenderedPageBreak/>
+        <w:t>Administrator@DESKTOP-FCQQ0BG MINGW64 /c/devops4sure520/Stack-Microsvc-K8s_Helm_ArgoCD_GitOps/kubedefs/platform/KARPENTER_k8s-manifests/17_02_Karpenter_On-demand_Instances (main)</w:t>
+      </w:r>
+    </w:p>
+    <w:p>
+      <w:r>
+        <w:t xml:space="preserve">$ </w:t>
+      </w:r>
+      <w:proofErr w:type="spellStart"/>
+      <w:r>
+        <w:t>kubectl</w:t>
+      </w:r>
+      <w:proofErr w:type="spellEnd"/>
+      <w:r>
+        <w:t xml:space="preserve"> get nodes</w:t>
+      </w:r>
+    </w:p>
+    <w:p>
+      <w:r>
+        <w:t>NAME                          STATUS   ROLES    AGE     VERSION</w:t>
+      </w:r>
+    </w:p>
+    <w:p>
+      <w:r>
+        <w:t>ip-10-0-10-112.ec2.internal   Ready    &lt;none&gt;   5m47s   v1.34.8-eks-3385e9b</w:t>
+      </w:r>
+    </w:p>
+    <w:p>
+      <w:r>
+        <w:t>ip-10-0-10-208.ec2.internal   Ready    &lt;none&gt;   22h     v1.34.8-eks-3385e9b</w:t>
+      </w:r>
+    </w:p>
+    <w:p>
+      <w:r>
+        <w:t>ip-10-0-11-168.ec2.internal   Ready    &lt;none&gt;   5m47s   v1.34.8-eks-3385e9b</w:t>
+      </w:r>
+    </w:p>
+    <w:p>
+      <w:r>
+        <w:t>ip-10-0-11-29.ec2.internal    Ready    &lt;none&gt;   22h     v1.34.8-eks-3385e9b</w:t>
+      </w:r>
+    </w:p>
+    <w:p>
+      <w:r>
+        <w:t>ip-10-0-12-184.ec2.internal   Ready    &lt;none&gt;   22h     v1.34.8-eks-3385e9b</w:t>
+      </w:r>
+    </w:p>
+    <w:p/>
+    <w:p>
+      <w:r>
+        <w:t>Administrator@DESKTOP-FCQQ0BG MINGW64 /c/devops4sure520/Stack-Microsvc-K8s_Helm_ArgoCD_GitOps/kubedefs/platform/KARPENTER_k8s-manifests/17_02_Karpenter_On-demand_Instances (main)</w:t>
+      </w:r>
+    </w:p>
+    <w:p>
+      <w:r>
+        <w:t xml:space="preserve">$ </w:t>
+      </w:r>
+    </w:p>
+    <w:p/>
+    <w:p>
+      <w:r>
+        <w:t>Administrator@DESKTOP-FCQQ0BG MINGW64 /c/devops4sure520/Stack-Microsvc-K8s_Helm_ArgoCD_GitOps/kubedefs/platform/KARPENTER_k8s-manifests/17_02_Karpenter_On-demand_Instances (main)</w:t>
+      </w:r>
+    </w:p>
+    <w:p>
+      <w:r>
+        <w:t xml:space="preserve">$ </w:t>
+      </w:r>
+      <w:proofErr w:type="spellStart"/>
+      <w:r>
+        <w:t>kubectl</w:t>
+      </w:r>
+      <w:proofErr w:type="spellEnd"/>
+      <w:r>
+        <w:t xml:space="preserve"> get deploy</w:t>
+      </w:r>
+    </w:p>
+    <w:p>
+      <w:r>
+        <w:t>NAME                                READY   UP-TO-DATE   AVAILABLE   AGE</w:t>
+      </w:r>
+    </w:p>
+    <w:p>
+      <w:proofErr w:type="spellStart"/>
+      <w:r>
+        <w:t>karpenter</w:t>
+      </w:r>
+      <w:proofErr w:type="spellEnd"/>
+      <w:r>
+        <w:t>-</w:t>
+      </w:r>
+      <w:proofErr w:type="spellStart"/>
+      <w:r>
+        <w:t>autoscale</w:t>
+      </w:r>
+      <w:proofErr w:type="spellEnd"/>
+      <w:r>
+        <w:t>-demo-</w:t>
+      </w:r>
+      <w:proofErr w:type="spellStart"/>
+      <w:r>
+        <w:t>ondemand</w:t>
+      </w:r>
+      <w:proofErr w:type="spellEnd"/>
+      <w:r>
+        <w:t xml:space="preserve">   5/5     5            5           8m40s</w:t>
+      </w:r>
+    </w:p>
+    <w:p/>
+    <w:p>
+      <w:r>
+        <w:t>Administrator@DESKTOP-FCQQ0BG MINGW64 /c/devops4sure520/Stack-Microsvc-K8s_Helm_ArgoCD_GitOps/kubedefs/platform/KARPENTER_k8s-manifests/17_02_Karpenter_On-demand_Instances (main)</w:t>
+      </w:r>
+    </w:p>
+    <w:p>
+      <w:r>
+        <w:t xml:space="preserve">$ </w:t>
+      </w:r>
+      <w:proofErr w:type="spellStart"/>
+      <w:r>
+        <w:t>kubectl</w:t>
+      </w:r>
+      <w:proofErr w:type="spellEnd"/>
+      <w:r>
+        <w:t xml:space="preserve"> scale deployment </w:t>
+      </w:r>
+      <w:proofErr w:type="spellStart"/>
+      <w:r>
+        <w:t>karpenter</w:t>
+      </w:r>
+      <w:proofErr w:type="spellEnd"/>
+      <w:r>
+        <w:t>-</w:t>
+      </w:r>
+      <w:proofErr w:type="spellStart"/>
+      <w:r>
+        <w:t>autoscale</w:t>
+      </w:r>
+      <w:proofErr w:type="spellEnd"/>
+      <w:r>
+        <w:t>-demo-</w:t>
+      </w:r>
+      <w:proofErr w:type="spellStart"/>
+      <w:r>
+        <w:t>ondemand</w:t>
+      </w:r>
+      <w:proofErr w:type="spellEnd"/>
+      <w:r>
+        <w:t xml:space="preserve"> --replicas=10</w:t>
+      </w:r>
+    </w:p>
+    <w:p>
+      <w:proofErr w:type="spellStart"/>
+      <w:r>
+        <w:t>deployment.apps</w:t>
+      </w:r>
+      <w:proofErr w:type="spellEnd"/>
+      <w:r>
+        <w:t>/</w:t>
+      </w:r>
+      <w:proofErr w:type="spellStart"/>
+      <w:r>
+        <w:t>karpenter</w:t>
+      </w:r>
+      <w:proofErr w:type="spellEnd"/>
+      <w:r>
+        <w:t>-</w:t>
+      </w:r>
+      <w:proofErr w:type="spellStart"/>
+      <w:r>
+        <w:t>autoscale</w:t>
+      </w:r>
+      <w:proofErr w:type="spellEnd"/>
+      <w:r>
+        <w:t>-demo-</w:t>
+      </w:r>
+      <w:proofErr w:type="spellStart"/>
+      <w:r>
+        <w:t>ondemand</w:t>
+      </w:r>
+      <w:proofErr w:type="spellEnd"/>
+      <w:r>
+        <w:t xml:space="preserve"> scaled</w:t>
+      </w:r>
+    </w:p>
+    <w:p/>
+    <w:p>
+      <w:r>
+        <w:t>Administrator@DESKTOP-FCQQ0BG MINGW64 /c/devops4sure520/Stack-Microsvc-K8s_Helm_ArgoCD_GitOps/kubedefs/platform/KARPENTER_k8s-manifests/17_02_Karpenter_On-demand_Instances (main)</w:t>
+      </w:r>
+    </w:p>
+    <w:p>
+      <w:r>
+        <w:t xml:space="preserve">$ </w:t>
+      </w:r>
+      <w:proofErr w:type="spellStart"/>
+      <w:r>
+        <w:t>kubectl</w:t>
+      </w:r>
+      <w:proofErr w:type="spellEnd"/>
+      <w:r>
+        <w:t xml:space="preserve"> get pods</w:t>
+      </w:r>
+    </w:p>
+    <w:p>
+      <w:r>
+        <w:t>NAME                                                 READY   STATUS    RESTARTS   AGE</w:t>
+      </w:r>
+    </w:p>
+    <w:p>
+      <w:r>
+        <w:t>karpenter-autoscale-demo-ondemand-6bd55b7cdd-8xf9h   1/1     Running   0          9m19s</w:t>
+      </w:r>
+    </w:p>
+    <w:p>
+      <w:r>
+        <w:t>karpenter-autoscale-demo-ondemand-6bd55b7cdd-fxrmb   0/1     Pending   0          13s</w:t>
+      </w:r>
+    </w:p>
+    <w:p>
+      <w:r>
+        <w:t>karpenter-autoscale-demo-ondemand-6bd55b7cdd-n5f89   0/1     Pending   0          13s</w:t>
+      </w:r>
+    </w:p>
+    <w:p>
+      <w:r>
+        <w:t>karpenter-autoscale-demo-ondemand-6bd55b7cdd-nwn6t   1/1     Running   0          9m19s</w:t>
+      </w:r>
+    </w:p>
+    <w:p>
+      <w:r>
+        <w:t>karpenter-autoscale-demo-ondemand-6bd55b7cdd-pw8hz   0/1     Pending   0          13s</w:t>
+      </w:r>
+    </w:p>
+    <w:p>
+      <w:r>
+        <w:t>karpenter-autoscale-demo-ondemand-6bd55b7cdd-rcjjz   0/1     Pending   0          13s</w:t>
+      </w:r>
+    </w:p>
+    <w:p>
+      <w:r>
+        <w:t>karpenter-autoscale-demo-ondemand-6bd55b7cdd-rlz62   1/1     Running   0          9m19s</w:t>
+      </w:r>
+    </w:p>
+    <w:p>
+      <w:r>
+        <w:t>karpenter-autoscale-demo-ondemand-6bd55b7cdd-t582r   0/1     Pending   0          13s</w:t>
+      </w:r>
+    </w:p>
+    <w:p>
+      <w:r>
+        <w:t>karpenter-autoscale-demo-ondemand-6bd55b7cdd-zn8sv   1/1     Running   0          9m19s</w:t>
+      </w:r>
+    </w:p>
+    <w:p>
+      <w:r>
+        <w:t>karpenter-autoscale-demo-ondemand-6bd55b7cdd-ztl96   1/1     Running   0          9m19s</w:t>
+      </w:r>
+    </w:p>
+    <w:p/>
+    <w:p>
+      <w:r>
+        <w:t>Administrator@DESKTOP-FCQQ0BG MINGW64 /c/devops4sure520/Stack-Microsvc-K8s_Helm_ArgoCD_GitOps/kubedefs/platform/KARPENTER_k8s-manifests/17_02_Karpenter_On-demand_Instances (main)</w:t>
+      </w:r>
+    </w:p>
+    <w:p>
+      <w:r>
+        <w:t xml:space="preserve">$ </w:t>
+      </w:r>
+      <w:proofErr w:type="spellStart"/>
+      <w:r>
+        <w:t>kubectl</w:t>
+      </w:r>
+      <w:proofErr w:type="spellEnd"/>
+      <w:r>
+        <w:t xml:space="preserve"> get </w:t>
+      </w:r>
+      <w:proofErr w:type="spellStart"/>
+      <w:r>
+        <w:t>nodeclaims</w:t>
+      </w:r>
+      <w:proofErr w:type="spellEnd"/>
+    </w:p>
+    <w:p>
+      <w:r>
+        <w:t>NAME                      TYPE        CAPACITY    ZONE         NODE                          READY     AGE</w:t>
+      </w:r>
+    </w:p>
+    <w:p>
+      <w:r>
+        <w:t>ondemand-nodepool-4clgz   t3.small    on-demand   us-east-1a                                 Unknown   22s</w:t>
+      </w:r>
+    </w:p>
+    <w:p>
+      <w:r>
+        <w:t>ondemand-nodepool-7nnsp   t3.small    on-demand   us-east-1b   ip-10-0-11-168.ec2.internal   True      9m28s</w:t>
+      </w:r>
+    </w:p>
+    <w:p>
+      <w:proofErr w:type="spellStart"/>
+      <w:r>
+        <w:t>ondemand-nodepool-srzdr</w:t>
+      </w:r>
+      <w:proofErr w:type="spellEnd"/>
+      <w:r>
+        <w:t xml:space="preserve">   t3a.small   on-demand   us-east-1b                                 Unknown   22s</w:t>
+      </w:r>
+    </w:p>
+    <w:p>
+      <w:proofErr w:type="spellStart"/>
+      <w:r>
+        <w:lastRenderedPageBreak/>
+        <w:t>ondemand-nodepool-xxffv</w:t>
+      </w:r>
+      <w:proofErr w:type="spellEnd"/>
+      <w:r>
+        <w:t xml:space="preserve">   t3a.small   on-demand   us-east-1a   ip-10-0-10-112.ec2.internal   True      9m28s</w:t>
+      </w:r>
+    </w:p>
+    <w:p/>
+    <w:p>
+      <w:r>
+        <w:t>Administrator@DESKTOP-FCQQ0BG MINGW64 /c/devops4sure520/Stack-Microsvc-K8s_Helm_ArgoCD_GitOps/kubedefs/platform/KARPENTER_k8s-manifests/17_02_Karpenter_On-demand_Instances (main)</w:t>
+      </w:r>
+    </w:p>
+    <w:p>
+      <w:r>
+        <w:t xml:space="preserve">$ </w:t>
+      </w:r>
+      <w:proofErr w:type="spellStart"/>
+      <w:r>
+        <w:t>kubectl</w:t>
+      </w:r>
+      <w:proofErr w:type="spellEnd"/>
+      <w:r>
+        <w:t xml:space="preserve"> get </w:t>
+      </w:r>
+      <w:proofErr w:type="spellStart"/>
+      <w:r>
+        <w:t>nodeclaims</w:t>
+      </w:r>
+      <w:proofErr w:type="spellEnd"/>
+    </w:p>
+    <w:p>
+      <w:r>
+        <w:t>NAME                      TYPE        CAPACITY    ZONE         NODE                          READY   AGE</w:t>
+      </w:r>
+    </w:p>
+    <w:p>
+      <w:r>
+        <w:t>ondemand-nodepool-4clgz   t3.small    on-demand   us-east-1a   ip-10-0-10-158.ec2.internal   True    43s</w:t>
+      </w:r>
+    </w:p>
+    <w:p>
+      <w:r>
+        <w:t>ondemand-nodepool-7nnsp   t3.small    on-demand   us-east-1b   ip-10-0-11-168.ec2.internal   True    9m49s</w:t>
+      </w:r>
+    </w:p>
+    <w:p>
+      <w:proofErr w:type="spellStart"/>
+      <w:r>
+        <w:t>ondemand-nodepool-srzdr</w:t>
+      </w:r>
+      <w:proofErr w:type="spellEnd"/>
+      <w:r>
+        <w:t xml:space="preserve">   t3a.small   on-demand   us-east-1b   ip-10-0-11-78.ec2.internal    True    43s</w:t>
+      </w:r>
+    </w:p>
+    <w:p>
+      <w:proofErr w:type="spellStart"/>
+      <w:r>
+        <w:t>ondemand-nodepool-xxffv</w:t>
+      </w:r>
+      <w:proofErr w:type="spellEnd"/>
+      <w:r>
+        <w:t xml:space="preserve">   t3a.small   on-demand   us-east-1a   ip-10-0-10-112.ec2.internal   True    9m49s</w:t>
+      </w:r>
+    </w:p>
+    <w:p/>
+    <w:p>
+      <w:r>
+        <w:t>Administrator@DESKTOP-FCQQ0BG MINGW64 /c/devops4sure520/Stack-Microsvc-K8s_Helm_ArgoCD_GitOps/kubedefs/platform/KARPENTER_k8s-manifests/17_02_Karpenter_On-demand_Instances (main)</w:t>
+      </w:r>
+    </w:p>
+    <w:p>
+      <w:r>
+        <w:t xml:space="preserve">$ </w:t>
+      </w:r>
+      <w:proofErr w:type="spellStart"/>
+      <w:r>
+        <w:t>kubectl</w:t>
+      </w:r>
+      <w:proofErr w:type="spellEnd"/>
+      <w:r>
+        <w:t xml:space="preserve"> get </w:t>
+      </w:r>
+      <w:proofErr w:type="spellStart"/>
+      <w:r>
+        <w:t>nodepools</w:t>
+      </w:r>
+      <w:proofErr w:type="spellEnd"/>
+    </w:p>
+    <w:p>
+      <w:r>
+        <w:t>NAME                NODECLASS              NODES   READY   AGE</w:t>
+      </w:r>
+    </w:p>
+    <w:p>
+      <w:proofErr w:type="spellStart"/>
+      <w:r>
+        <w:t>ondemand-nodepool</w:t>
+      </w:r>
+      <w:proofErr w:type="spellEnd"/>
+      <w:r>
+        <w:t xml:space="preserve">   default-ec2nodeclass   4       True    15m</w:t>
+      </w:r>
+    </w:p>
+    <w:p>
+      <w:r>
+        <w:t>spot-</w:t>
+      </w:r>
+      <w:proofErr w:type="spellStart"/>
+      <w:r>
+        <w:t>nodepool</w:t>
+      </w:r>
+      <w:proofErr w:type="spellEnd"/>
+      <w:r>
+        <w:t xml:space="preserve">       default-ec2nodeclass   0       True    15m</w:t>
+      </w:r>
+    </w:p>
+    <w:p/>
+    <w:p>
+      <w:r>
+        <w:t>Administrator@DESKTOP-FCQQ0BG MINGW64 /c/devops4sure520/Stack-Microsvc-K8s_Helm_ArgoCD_GitOps/kubedefs/platform/KARPENTER_k8s-manifests/17_02_Karpenter_On-demand_Instances (main)</w:t>
+      </w:r>
+    </w:p>
+    <w:p>
+      <w:r>
+        <w:t xml:space="preserve">$ </w:t>
+      </w:r>
+      <w:proofErr w:type="spellStart"/>
+      <w:r>
+        <w:t>kubectl</w:t>
+      </w:r>
+      <w:proofErr w:type="spellEnd"/>
+      <w:r>
+        <w:t xml:space="preserve"> get nodes</w:t>
+      </w:r>
+    </w:p>
+    <w:p>
+      <w:r>
+        <w:lastRenderedPageBreak/>
+        <w:t>NAME                          STATUS   ROLES    AGE     VERSION</w:t>
+      </w:r>
+    </w:p>
+    <w:p>
+      <w:r>
+        <w:t>ip-10-0-10-112.ec2.internal   Ready    &lt;none&gt;   9m54s   v1.34.8-eks-3385e9b</w:t>
+      </w:r>
+    </w:p>
+    <w:p>
+      <w:r>
+        <w:t>ip-10-0-10-158.ec2.internal   Ready    &lt;none&gt;   49s     v1.34.8-eks-3385e9b</w:t>
+      </w:r>
+    </w:p>
+    <w:p>
+      <w:r>
+        <w:t>ip-10-0-10-208.ec2.internal   Ready    &lt;none&gt;   22h     v1.34.8-eks-3385e9b</w:t>
+      </w:r>
+    </w:p>
+    <w:p>
+      <w:r>
+        <w:t>ip-10-0-11-168.ec2.internal   Ready    &lt;none&gt;   9m54s   v1.34.8-eks-3385e9b</w:t>
+      </w:r>
+    </w:p>
+    <w:p>
+      <w:r>
+        <w:t>ip-10-0-11-29.ec2.internal    Ready    &lt;none&gt;   22h     v1.34.8-eks-3385e9b</w:t>
+      </w:r>
+    </w:p>
+    <w:p>
+      <w:r>
+        <w:t>ip-10-0-11-78.ec2.internal    Ready    &lt;none&gt;   46s     v1.34.8-eks-3385e9b</w:t>
+      </w:r>
+    </w:p>
+    <w:p>
+      <w:r>
+        <w:t>ip-10-0-12-184.ec2.internal   Ready    &lt;none&gt;   22h     v1.34.8-eks-3385e9b</w:t>
+      </w:r>
+    </w:p>
+    <w:p/>
+    <w:p>
+      <w:r>
+        <w:t>Administrator@DESKTOP-FCQQ0BG MINGW64 /c/devops4sure520/Stack-Microsvc-K8s_Helm_ArgoCD_GitOps/kubedefs/platform/KARPENTER_k8s-manifests/17_02_Karpenter_On-demand_Instances (main)</w:t>
+      </w:r>
+    </w:p>
+    <w:p>
+      <w:r>
+        <w:t xml:space="preserve">$ </w:t>
+      </w:r>
+      <w:proofErr w:type="spellStart"/>
+      <w:r>
+        <w:t>kubectl</w:t>
+      </w:r>
+      <w:proofErr w:type="spellEnd"/>
+      <w:r>
+        <w:t xml:space="preserve"> get pods</w:t>
+      </w:r>
+    </w:p>
+    <w:p>
+      <w:r>
+        <w:t>NAME                                                 READY   STATUS    RESTARTS   AGE</w:t>
+      </w:r>
+    </w:p>
+    <w:p>
+      <w:r>
+        <w:t>karpenter-autoscale-demo-ondemand-6bd55b7cdd-8xf9h   1/1     Running   0          10m</w:t>
+      </w:r>
+    </w:p>
+    <w:p>
+      <w:r>
+        <w:t>karpenter-autoscale-demo-ondemand-6bd55b7cdd-fxrmb   1/1     Running   0          91s</w:t>
+      </w:r>
+    </w:p>
+    <w:p>
+      <w:r>
+        <w:t>karpenter-autoscale-demo-ondemand-6bd55b7cdd-n5f89   1/1     Running   0          91s</w:t>
+      </w:r>
+    </w:p>
+    <w:p>
+      <w:r>
+        <w:t>karpenter-autoscale-demo-ondemand-6bd55b7cdd-nwn6t   1/1     Running   0          10m</w:t>
+      </w:r>
+    </w:p>
+    <w:p>
+      <w:r>
+        <w:t>karpenter-autoscale-demo-ondemand-6bd55b7cdd-pw8hz   1/1     Running   0          91s</w:t>
+      </w:r>
+    </w:p>
+    <w:p>
+      <w:r>
+        <w:t>karpenter-autoscale-demo-ondemand-6bd55b7cdd-rcjjz   1/1     Running   0          91s</w:t>
+      </w:r>
+    </w:p>
+    <w:p>
+      <w:r>
+        <w:t>karpenter-autoscale-demo-ondemand-6bd55b7cdd-rlz62   1/1     Running   0          10m</w:t>
+      </w:r>
+    </w:p>
+    <w:p>
+      <w:r>
+        <w:t>karpenter-autoscale-demo-ondemand-6bd55b7cdd-t582r   1/1     Running   0          91s</w:t>
+      </w:r>
+    </w:p>
+    <w:p>
+      <w:r>
+        <w:t>karpenter-autoscale-demo-ondemand-6bd55b7cdd-zn8sv   1/1     Running   0          10m</w:t>
+      </w:r>
+    </w:p>
+    <w:p>
+      <w:r>
+        <w:t>karpenter-autoscale-demo-ondemand-6bd55b7cdd-ztl96   1/1     Running   0          10m</w:t>
+      </w:r>
+    </w:p>
+    <w:p/>
+    <w:p>
+      <w:r>
+        <w:lastRenderedPageBreak/>
+        <w:t>Administrator@DESKTOP-FCQQ0BG MINGW64 /c/devops4sure520/Stack-Microsvc-K8s_Helm_ArgoCD_GitOps/kubedefs/platform/KARPENTER_k8s-manifests/17_02_Karpenter_On-demand_Instances (main)</w:t>
+      </w:r>
+    </w:p>
+    <w:p>
+      <w:r>
+        <w:t xml:space="preserve">$ </w:t>
+      </w:r>
+      <w:proofErr w:type="spellStart"/>
+      <w:r>
+        <w:t>kubectl</w:t>
+      </w:r>
+      <w:proofErr w:type="spellEnd"/>
+      <w:r>
+        <w:t xml:space="preserve"> scale deployment </w:t>
+      </w:r>
+      <w:proofErr w:type="spellStart"/>
+      <w:r>
+        <w:t>karpenter</w:t>
+      </w:r>
+      <w:proofErr w:type="spellEnd"/>
+      <w:r>
+        <w:t>-</w:t>
+      </w:r>
+      <w:proofErr w:type="spellStart"/>
+      <w:r>
+        <w:t>autoscale</w:t>
+      </w:r>
+      <w:proofErr w:type="spellEnd"/>
+      <w:r>
+        <w:t>-demo-</w:t>
+      </w:r>
+      <w:proofErr w:type="spellStart"/>
+      <w:r>
+        <w:t>ondemand</w:t>
+      </w:r>
+      <w:proofErr w:type="spellEnd"/>
+      <w:r>
+        <w:t xml:space="preserve"> --replicas=2</w:t>
+      </w:r>
+    </w:p>
+    <w:p>
+      <w:proofErr w:type="spellStart"/>
+      <w:r>
+        <w:t>deployment.apps</w:t>
+      </w:r>
+      <w:proofErr w:type="spellEnd"/>
+      <w:r>
+        <w:t>/</w:t>
+      </w:r>
+      <w:proofErr w:type="spellStart"/>
+      <w:r>
+        <w:t>karpenter</w:t>
+      </w:r>
+      <w:proofErr w:type="spellEnd"/>
+      <w:r>
+        <w:t>-</w:t>
+      </w:r>
+      <w:proofErr w:type="spellStart"/>
+      <w:r>
+        <w:t>autoscale</w:t>
+      </w:r>
+      <w:proofErr w:type="spellEnd"/>
+      <w:r>
+        <w:t>-demo-</w:t>
+      </w:r>
+      <w:proofErr w:type="spellStart"/>
+      <w:r>
+        <w:t>ondemand</w:t>
+      </w:r>
+      <w:proofErr w:type="spellEnd"/>
+      <w:r>
+        <w:t xml:space="preserve"> scaled</w:t>
+      </w:r>
+    </w:p>
+    <w:p/>
+    <w:p>
+      <w:r>
+        <w:t>Administrator@DESKTOP-FCQQ0BG MINGW64 /c/devops4sure520/Stack-Microsvc-K8s_Helm_ArgoCD_GitOps/kubedefs/platform/KARPENTER_k8s-manifests/17_02_Karpenter_On-demand_Instances (main)</w:t>
+      </w:r>
+    </w:p>
+    <w:p>
+      <w:r>
+        <w:t xml:space="preserve">$ </w:t>
+      </w:r>
+      <w:proofErr w:type="spellStart"/>
+      <w:r>
+        <w:t>kubectl</w:t>
+      </w:r>
+      <w:proofErr w:type="spellEnd"/>
+      <w:r>
+        <w:t xml:space="preserve"> get pods</w:t>
+      </w:r>
+    </w:p>
+    <w:p>
+      <w:r>
+        <w:t>NAME                                                 READY   STATUS    RESTARTS   AGE</w:t>
+      </w:r>
+    </w:p>
+    <w:p>
+      <w:r>
+        <w:t>karpenter-autoscale-demo-ondemand-6bd55b7cdd-nwn6t   1/1     Running   0          11m</w:t>
+      </w:r>
+    </w:p>
+    <w:p>
+      <w:r>
+        <w:t>karpenter-autoscale-demo-ondemand-6bd55b7cdd-zn8sv   1/1     Running   0          11m</w:t>
+      </w:r>
+    </w:p>
+    <w:p/>
+    <w:p>
+      <w:r>
+        <w:t>Administrator@DESKTOP-FCQQ0BG MINGW64 /c/devops4sure520/Stack-Microsvc-K8s_Helm_ArgoCD_GitOps/kubedefs/platform/KARPENTER_k8s-manifests/17_02_Karpenter_On-demand_Instances (main)</w:t>
+      </w:r>
+    </w:p>
+    <w:p>
+      <w:r>
+        <w:t xml:space="preserve">$ </w:t>
+      </w:r>
+      <w:proofErr w:type="spellStart"/>
+      <w:r>
+        <w:t>kubectl</w:t>
+      </w:r>
+      <w:proofErr w:type="spellEnd"/>
+      <w:r>
+        <w:t xml:space="preserve"> get </w:t>
+      </w:r>
+      <w:proofErr w:type="spellStart"/>
+      <w:r>
+        <w:t>nodeclaims</w:t>
+      </w:r>
+      <w:proofErr w:type="spellEnd"/>
+    </w:p>
+    <w:p>
+      <w:r>
+        <w:t>NAME                      TYPE        CAPACITY    ZONE         NODE                          READY   AGE</w:t>
+      </w:r>
+    </w:p>
+    <w:p>
+      <w:r>
+        <w:t>ondemand-nodepool-4clgz   t3.small    on-demand   us-east-1a   ip-10-0-10-158.ec2.internal   True    2m22s</w:t>
+      </w:r>
+    </w:p>
+    <w:p>
+      <w:r>
+        <w:t>ondemand-nodepool-7nnsp   t3.small    on-demand   us-east-1b   ip-10-0-11-168.ec2.internal   True    11m</w:t>
+      </w:r>
+    </w:p>
+    <w:p>
+      <w:proofErr w:type="spellStart"/>
+      <w:r>
+        <w:t>ondemand-nodepool-srzdr</w:t>
+      </w:r>
+      <w:proofErr w:type="spellEnd"/>
+      <w:r>
+        <w:t xml:space="preserve">   t3a.small   on-demand   us-east-1b   ip-10-0-11-78.ec2.internal    True    2m22s</w:t>
+      </w:r>
+    </w:p>
+    <w:p>
+      <w:proofErr w:type="spellStart"/>
+      <w:r>
+        <w:t>ondemand-nodepool-xxffv</w:t>
+      </w:r>
+      <w:proofErr w:type="spellEnd"/>
+      <w:r>
+        <w:t xml:space="preserve">   t3a.small   on-demand   us-east-1a   ip-10-0-10-112.ec2.internal   True    11m</w:t>
+      </w:r>
+    </w:p>
+    <w:p/>
+    <w:p>
+      <w:r>
+        <w:lastRenderedPageBreak/>
+        <w:t>Administrator@DESKTOP-FCQQ0BG MINGW64 /c/devops4sure520/Stack-Microsvc-K8s_Helm_ArgoCD_GitOps/kubedefs/platform/KARPENTER_k8s-manifests/17_02_Karpenter_On-demand_Instances (main)</w:t>
+      </w:r>
+    </w:p>
+    <w:p>
+      <w:r>
+        <w:t xml:space="preserve">$ </w:t>
+      </w:r>
+      <w:proofErr w:type="spellStart"/>
+      <w:r>
+        <w:t>kubectl</w:t>
+      </w:r>
+      <w:proofErr w:type="spellEnd"/>
+      <w:r>
+        <w:t xml:space="preserve"> get </w:t>
+      </w:r>
+      <w:proofErr w:type="spellStart"/>
+      <w:r>
+        <w:t>nodeclaims</w:t>
+      </w:r>
+      <w:proofErr w:type="spellEnd"/>
+    </w:p>
+    <w:p>
+      <w:r>
+        <w:t>NAME                      TYPE        CAPACITY    ZONE         NODE                          READY   AGE</w:t>
+      </w:r>
+    </w:p>
+    <w:p>
+      <w:r>
+        <w:t>ondemand-nodepool-4clgz   t3.small    on-demand   us-east-1a   ip-10-0-10-158.ec2.internal   True    3m6s</w:t>
+      </w:r>
+    </w:p>
+    <w:p>
+      <w:r>
+        <w:t>ondemand-nodepool-7nnsp   t3.small    on-demand   us-east-1b   ip-10-0-11-168.ec2.internal   True    12m</w:t>
+      </w:r>
+    </w:p>
+    <w:p>
+      <w:proofErr w:type="spellStart"/>
+      <w:r>
+        <w:t>ondemand-nodepool-srzdr</w:t>
+      </w:r>
+      <w:proofErr w:type="spellEnd"/>
+      <w:r>
+        <w:t xml:space="preserve">   t3a.small   on-demand   us-east-1b   ip-10-0-11-78.ec2.internal    True    3m6s</w:t>
+      </w:r>
+    </w:p>
+    <w:p/>
+    <w:p>
+      <w:r>
+        <w:t>Administrator@DESKTOP-FCQQ0BG MINGW64 /c/devops4sure520/Stack-Microsvc-K8s_Helm_ArgoCD_GitOps/kubedefs/platform/KARPENTER_k8s-manifests/17_02_Karpenter_On-demand_Instances (main)</w:t>
+      </w:r>
+    </w:p>
+    <w:p>
+      <w:r>
+        <w:t xml:space="preserve">$ </w:t>
+      </w:r>
+      <w:proofErr w:type="spellStart"/>
+      <w:r>
+        <w:t>kubectl</w:t>
+      </w:r>
+      <w:proofErr w:type="spellEnd"/>
+      <w:r>
+        <w:t xml:space="preserve"> get </w:t>
+      </w:r>
+      <w:proofErr w:type="spellStart"/>
+      <w:r>
+        <w:t>nodeclaims</w:t>
+      </w:r>
+      <w:proofErr w:type="spellEnd"/>
+    </w:p>
+    <w:p>
+      <w:r>
+        <w:t>NAME                      TYPE        CAPACITY    ZONE         NODE                          READY   AGE</w:t>
+      </w:r>
+    </w:p>
+    <w:p>
+      <w:r>
+        <w:t>ondemand-nodepool-4clgz   t3.small    on-demand   us-east-1a   ip-10-0-10-158.ec2.internal   True    3m23s</w:t>
+      </w:r>
+    </w:p>
+    <w:p>
+      <w:proofErr w:type="spellStart"/>
+      <w:r>
+        <w:t>ondemand-nodepool-srzdr</w:t>
+      </w:r>
+      <w:proofErr w:type="spellEnd"/>
+      <w:r>
+        <w:t xml:space="preserve">   t3a.small   on-demand   us-east-1b   ip-10-0-11-78.ec2.internal    True    3m23s</w:t>
+      </w:r>
+    </w:p>
+    <w:p/>
+    <w:p>
+      <w:r>
+        <w:t>Administrator@DESKTOP-FCQQ0BG MINGW64 /c/devops4sure520/Stack-Microsvc-K8s_Helm_ArgoCD_GitOps/kubedefs/platform/KARPENTER_k8s-manifests/17_02_Karpenter_On-demand_Instances (main)</w:t>
+      </w:r>
+    </w:p>
+    <w:p>
+      <w:r>
+        <w:t xml:space="preserve">$ </w:t>
+      </w:r>
+      <w:proofErr w:type="spellStart"/>
+      <w:r>
+        <w:t>kubectl</w:t>
+      </w:r>
+      <w:proofErr w:type="spellEnd"/>
+      <w:r>
+        <w:t xml:space="preserve"> get </w:t>
+      </w:r>
+      <w:proofErr w:type="spellStart"/>
+      <w:r>
+        <w:t>nodeclaims</w:t>
+      </w:r>
+      <w:proofErr w:type="spellEnd"/>
+    </w:p>
+    <w:p>
+      <w:r>
+        <w:t>NAME                      TYPE        CAPACITY    ZONE         NODE                          READY     AGE</w:t>
+      </w:r>
+    </w:p>
+    <w:p>
+      <w:r>
+        <w:t>ondemand-nodepool-4clgz   t3.small    on-demand   us-east-1a   ip-10-0-10-158.ec2.internal   True      4m11s</w:t>
+      </w:r>
+    </w:p>
+    <w:p>
+      <w:r>
+        <w:lastRenderedPageBreak/>
+        <w:t>ondemand-nodepool-v85pq   t3a.small   on-demand   us-east-1b                                 Unknown   19s</w:t>
+      </w:r>
+    </w:p>
+    <w:p/>
+    <w:p>
+      <w:r>
+        <w:t>Administrator@DESKTOP-FCQQ0BG MINGW64 /c/devops4sure520/Stack-Microsvc-K8s_Helm_ArgoCD_GitOps/kubedefs/platform/KARPENTER_k8s-manifests/17_02_Karpenter_On-demand_Instances (main)</w:t>
+      </w:r>
+    </w:p>
+    <w:p>
+      <w:r>
+        <w:t xml:space="preserve">$ </w:t>
+      </w:r>
+      <w:proofErr w:type="spellStart"/>
+      <w:r>
+        <w:t>kubectl</w:t>
+      </w:r>
+      <w:proofErr w:type="spellEnd"/>
+      <w:r>
+        <w:t xml:space="preserve"> get </w:t>
+      </w:r>
+      <w:proofErr w:type="spellStart"/>
+      <w:r>
+        <w:t>nodeclaims</w:t>
+      </w:r>
+      <w:proofErr w:type="spellEnd"/>
+    </w:p>
+    <w:p>
+      <w:r>
+        <w:t>NAME                      TYPE        CAPACITY    ZONE         NODE                          READY   AGE</w:t>
+      </w:r>
+    </w:p>
+    <w:p>
+      <w:r>
+        <w:t>ondemand-nodepool-4clgz   t3.small    on-demand   us-east-1a   ip-10-0-10-158.ec2.internal   True    4m43s</w:t>
+      </w:r>
+    </w:p>
+    <w:p>
+      <w:r>
+        <w:t>ondemand-nodepool-v85pq   t3a.small   on-demand   us-east-1b   ip-10-0-11-241.ec2.internal   True    51s</w:t>
+      </w:r>
+    </w:p>
+    <w:p/>
+    <w:p>
+      <w:r>
+        <w:t>Administrator@DESKTOP-FCQQ0BG MINGW64 /c/devops4sure520/Stack-Microsvc-K8s_Helm_ArgoCD_GitOps/kubedefs/platform/KARPENTER_k8s-manifests/17_02_Karpenter_On-demand_Instances (main)</w:t>
+      </w:r>
+    </w:p>
+    <w:p>
+      <w:r>
+        <w:t>$ ls</w:t>
+      </w:r>
+    </w:p>
+    <w:p>
+      <w:proofErr w:type="spellStart"/>
+      <w:r>
+        <w:t>kube</w:t>
+      </w:r>
+      <w:proofErr w:type="spellEnd"/>
+      <w:r>
+        <w:t>-manifests-On-demand/  README.md</w:t>
+      </w:r>
+    </w:p>
+    <w:p/>
+    <w:p>
+      <w:r>
+        <w:t>Administrator@DESKTOP-FCQQ0BG MINGW64 /c/devops4sure520/Stack-Microsvc-K8s_Helm_ArgoCD_GitOps/kubedefs/platform/KARPENTER_k8s-manifests/17_02_Karpenter_On-demand_Instances (main)</w:t>
+      </w:r>
+    </w:p>
+    <w:p>
+      <w:r>
+        <w:t xml:space="preserve">$ </w:t>
+      </w:r>
+      <w:proofErr w:type="spellStart"/>
+      <w:r>
+        <w:t>kubectl</w:t>
+      </w:r>
+      <w:proofErr w:type="spellEnd"/>
+      <w:r>
+        <w:t xml:space="preserve"> delete -f </w:t>
+      </w:r>
+      <w:proofErr w:type="spellStart"/>
+      <w:r>
+        <w:t>kube</w:t>
+      </w:r>
+      <w:proofErr w:type="spellEnd"/>
+      <w:r>
+        <w:t>-manifests-On-demand/</w:t>
+      </w:r>
+    </w:p>
+    <w:p>
+      <w:proofErr w:type="spellStart"/>
+      <w:r>
+        <w:t>deployment.apps</w:t>
+      </w:r>
+      <w:proofErr w:type="spellEnd"/>
+      <w:r>
+        <w:t xml:space="preserve"> "</w:t>
+      </w:r>
+      <w:proofErr w:type="spellStart"/>
+      <w:r>
+        <w:t>karpenter</w:t>
+      </w:r>
+      <w:proofErr w:type="spellEnd"/>
+      <w:r>
+        <w:t>-</w:t>
+      </w:r>
+      <w:proofErr w:type="spellStart"/>
+      <w:r>
+        <w:t>autoscale</w:t>
+      </w:r>
+      <w:proofErr w:type="spellEnd"/>
+      <w:r>
+        <w:t>-demo-</w:t>
+      </w:r>
+      <w:proofErr w:type="spellStart"/>
+      <w:r>
+        <w:t>ondemand</w:t>
+      </w:r>
+      <w:proofErr w:type="spellEnd"/>
+      <w:r>
+        <w:t>" deleted from default namespace</w:t>
+      </w:r>
+    </w:p>
+    <w:p/>
+    <w:p>
+      <w:r>
+        <w:t>Administrator@DESKTOP-FCQQ0BG MINGW64 /c/devops4sure520/Stack-Microsvc-K8s_Helm_ArgoCD_GitOps/kubedefs/platform/KARPENTER_k8s-manifests/17_02_Karpenter_On-demand_Instances (main)</w:t>
+      </w:r>
+    </w:p>
+    <w:p>
+      <w:r>
+        <w:t xml:space="preserve">$ </w:t>
+      </w:r>
+      <w:proofErr w:type="spellStart"/>
+      <w:r>
+        <w:t>kubectl</w:t>
+      </w:r>
+      <w:proofErr w:type="spellEnd"/>
+      <w:r>
+        <w:t xml:space="preserve"> get </w:t>
+      </w:r>
+      <w:proofErr w:type="spellStart"/>
+      <w:r>
+        <w:t>nodeclaims</w:t>
+      </w:r>
+      <w:proofErr w:type="spellEnd"/>
+    </w:p>
+    <w:p>
+      <w:r>
+        <w:lastRenderedPageBreak/>
+        <w:t>NAME                      TYPE        CAPACITY    ZONE         NODE                          READY   AGE</w:t>
+      </w:r>
+    </w:p>
+    <w:p>
+      <w:r>
+        <w:t>ondemand-nodepool-v85pq   t3a.small   on-demand   us-east-1b   ip-10-0-11-241.ec2.internal   True    84s</w:t>
+      </w:r>
+    </w:p>
+    <w:p/>
+    <w:p>
+      <w:r>
+        <w:t>Administrator@DESKTOP-FCQQ0BG MINGW64 /c/devops4sure520/Stack-Microsvc-K8s_Helm_ArgoCD_GitOps/kubedefs/platform/KARPENTER_k8s-manifests/17_02_Karpenter_On-demand_Instances (main)</w:t>
+      </w:r>
+    </w:p>
+    <w:p>
+      <w:r>
+        <w:t xml:space="preserve">$ </w:t>
+      </w:r>
+      <w:proofErr w:type="spellStart"/>
+      <w:r>
+        <w:t>kubectl</w:t>
+      </w:r>
+      <w:proofErr w:type="spellEnd"/>
+      <w:r>
+        <w:t xml:space="preserve"> get pods</w:t>
+      </w:r>
+    </w:p>
+    <w:p>
+      <w:r>
+        <w:t>No resources found in default namespace.</w:t>
+      </w:r>
+    </w:p>
+    <w:p/>
+    <w:p>
+      <w:r>
+        <w:t>Administrator@DESKTOP-FCQQ0BG MINGW64 /c/devops4sure520/Stack-Microsvc-K8s_Helm_ArgoCD_GitOps/kubedefs/platform/KARPENTER_k8s-manifests/17_02_Karpenter_On-demand_Instances (main)</w:t>
+      </w:r>
+    </w:p>
+    <w:p>
+      <w:r>
+        <w:t xml:space="preserve">$ </w:t>
+      </w:r>
+      <w:proofErr w:type="spellStart"/>
+      <w:r>
+        <w:t>kubectl</w:t>
+      </w:r>
+      <w:proofErr w:type="spellEnd"/>
+      <w:r>
+        <w:t xml:space="preserve"> get </w:t>
+      </w:r>
+      <w:proofErr w:type="spellStart"/>
+      <w:r>
+        <w:t>nodeclaims</w:t>
+      </w:r>
+      <w:proofErr w:type="spellEnd"/>
+    </w:p>
+    <w:p>
+      <w:r>
+        <w:t>NAME                      TYPE        CAPACITY    ZONE         NODE                          READY   AGE</w:t>
+      </w:r>
+    </w:p>
+    <w:p>
+      <w:r>
+        <w:t>ondemand-nodepool-v85pq   t3a.small   on-demand   us-east-1b   ip-10-0-11-241.ec2.internal   True    109s</w:t>
+      </w:r>
+    </w:p>
+    <w:p/>
+    <w:p>
+      <w:r>
+        <w:t>Administrator@DESKTOP-FCQQ0BG MINGW64 /c/devops4sure520/Stack-Microsvc-K8s_Helm_ArgoCD_GitOps/kubedefs/platform/KARPENTER_k8s-manifests/17_02_Karpenter_On-demand_Instances (main)</w:t>
+      </w:r>
+    </w:p>
+    <w:p>
+      <w:r>
+        <w:t xml:space="preserve">$ </w:t>
+      </w:r>
+      <w:proofErr w:type="spellStart"/>
+      <w:r>
+        <w:t>kubectl</w:t>
+      </w:r>
+      <w:proofErr w:type="spellEnd"/>
+      <w:r>
+        <w:t xml:space="preserve"> get nodes</w:t>
+      </w:r>
+    </w:p>
+    <w:p>
+      <w:r>
+        <w:t>NAME                          STATUS     ROLES    AGE   VERSION</w:t>
+      </w:r>
+    </w:p>
+    <w:p>
+      <w:r>
+        <w:t>ip-10-0-10-208.ec2.internal   Ready      &lt;none&gt;   22h   v1.34.8-eks-3385e9b</w:t>
+      </w:r>
+    </w:p>
+    <w:p>
+      <w:r>
+        <w:t xml:space="preserve">ip-10-0-11-241.ec2.internal   </w:t>
+      </w:r>
+      <w:proofErr w:type="spellStart"/>
+      <w:r>
+        <w:t>NotReady</w:t>
+      </w:r>
+      <w:proofErr w:type="spellEnd"/>
+      <w:r>
+        <w:t xml:space="preserve">   &lt;none&gt;   99s   v1.34.8-eks-3385e9b</w:t>
+      </w:r>
+    </w:p>
+    <w:p>
+      <w:r>
+        <w:t>ip-10-0-11-29.ec2.internal    Ready      &lt;none&gt;   22h   v1.34.8-eks-3385e9b</w:t>
+      </w:r>
+    </w:p>
+    <w:p>
+      <w:r>
+        <w:t>ip-10-0-12-184.ec2.internal   Ready      &lt;none&gt;   22h   v1.34.8-eks-3385e9b</w:t>
+      </w:r>
+    </w:p>
+    <w:p/>
+    <w:p>
+      <w:r>
+        <w:lastRenderedPageBreak/>
+        <w:t>Administrator@DESKTOP-FCQQ0BG MINGW64 /c/devops4sure520/Stack-Microsvc-K8s_Helm_ArgoCD_GitOps/kubedefs/platform/KARPENTER_k8s-manifests/17_02_Karpenter_On-demand_Instances (main)</w:t>
+      </w:r>
+    </w:p>
+    <w:p>
+      <w:r>
+        <w:t xml:space="preserve">$ </w:t>
+      </w:r>
+      <w:proofErr w:type="spellStart"/>
+      <w:r>
+        <w:t>kubectl</w:t>
+      </w:r>
+      <w:proofErr w:type="spellEnd"/>
+      <w:r>
+        <w:t xml:space="preserve"> get </w:t>
+      </w:r>
+      <w:proofErr w:type="spellStart"/>
+      <w:r>
+        <w:t>nodeclaims</w:t>
+      </w:r>
+      <w:proofErr w:type="spellEnd"/>
+    </w:p>
+    <w:p>
+      <w:r>
+        <w:t>NAME                      TYPE        CAPACITY    ZONE         NODE                          READY   AGE</w:t>
+      </w:r>
+    </w:p>
+    <w:p>
+      <w:r>
+        <w:t>ondemand-nodepool-v85pq   t3a.small   on-demand   us-east-1b   ip-10-0-11-241.ec2.internal   True    2m16s</w:t>
+      </w:r>
+    </w:p>
+    <w:p/>
+    <w:p>
+      <w:r>
+        <w:t>Administrator@DESKTOP-FCQQ0BG MINGW64 /c/devops4sure520/Stack-Microsvc-K8s_Helm_ArgoCD_GitOps/kubedefs/platform/KARPENTER_k8s-manifests/17_02_Karpenter_On-demand_Instances (main)</w:t>
+      </w:r>
+    </w:p>
+    <w:p>
+      <w:r>
+        <w:t xml:space="preserve">$ </w:t>
+      </w:r>
+      <w:proofErr w:type="spellStart"/>
+      <w:r>
+        <w:t>kubectl</w:t>
+      </w:r>
+      <w:proofErr w:type="spellEnd"/>
+      <w:r>
+        <w:t xml:space="preserve"> get nodes</w:t>
+      </w:r>
+    </w:p>
+    <w:p>
+      <w:r>
+        <w:t>NAME                          STATUS     ROLES    AGE    VERSION</w:t>
+      </w:r>
+    </w:p>
+    <w:p>
+      <w:r>
+        <w:t>ip-10-0-10-208.ec2.internal   Ready      &lt;none&gt;   22h    v1.34.8-eks-3385e9b</w:t>
+      </w:r>
+    </w:p>
+    <w:p>
+      <w:r>
+        <w:t xml:space="preserve">ip-10-0-11-241.ec2.internal   </w:t>
+      </w:r>
+      <w:proofErr w:type="spellStart"/>
+      <w:r>
+        <w:t>NotReady</w:t>
+      </w:r>
+      <w:proofErr w:type="spellEnd"/>
+      <w:r>
+        <w:t xml:space="preserve">   &lt;none&gt;   2m5s   v1.34.8-eks-3385e9b</w:t>
+      </w:r>
+    </w:p>
+    <w:p>
+      <w:r>
+        <w:t>ip-10-0-11-29.ec2.internal    Ready      &lt;none&gt;   22h    v1.34.8-eks-3385e9b</w:t>
+      </w:r>
+    </w:p>
+    <w:p>
+      <w:r>
+        <w:t>ip-10-0-12-184.ec2.internal   Ready      &lt;none&gt;   22h    v1.34.8-eks-3385e9b</w:t>
+      </w:r>
+    </w:p>
+    <w:p/>
+    <w:p>
+      <w:r>
+        <w:t>Administrator@DESKTOP-FCQQ0BG MINGW64 /c/devops4sure520/Stack-Microsvc-K8s_Helm_ArgoCD_GitOps/kubedefs/platform/KARPENTER_k8s-manifests/17_02_Karpenter_On-demand_Instances (main)</w:t>
+      </w:r>
+    </w:p>
+    <w:p>
+      <w:r>
+        <w:t>$</w:t>
+      </w:r>
+    </w:p>
+    <w:p/>
+    <w:p>
+      <w:r>
+        <w:t>Administrator@DESKTOP-FCQQ0BG MINGW64 /c/devops4sure520/Stack-Microsvc-K8s_Helm_ArgoCD_GitOps/kubedefs/platform/KARPENTER_k8s-manifests/17_02_Karpenter_On-demand_Instances (main)</w:t>
+      </w:r>
+    </w:p>
+    <w:p>
+      <w:r>
+        <w:t xml:space="preserve">$ </w:t>
+      </w:r>
+      <w:proofErr w:type="spellStart"/>
+      <w:r>
+        <w:t>kubectl</w:t>
+      </w:r>
+      <w:proofErr w:type="spellEnd"/>
+      <w:r>
+        <w:t xml:space="preserve"> get nodes</w:t>
+      </w:r>
+    </w:p>
+    <w:p>
+      <w:r>
+        <w:t>NAME                          STATUS   ROLES    AGE   VERSION</w:t>
+      </w:r>
+    </w:p>
+    <w:p>
+      <w:r>
+        <w:t>ip-10-0-10-208.ec2.internal   Ready    &lt;none&gt;   22h   v1.34.8-eks-3385e9b</w:t>
+      </w:r>
+    </w:p>
+    <w:p>
+      <w:r>
+        <w:lastRenderedPageBreak/>
+        <w:t>ip-10-0-11-29.ec2.internal    Ready    &lt;none&gt;   22h   v1.34.8-eks-3385e9b</w:t>
+      </w:r>
+    </w:p>
+    <w:p>
+      <w:r>
+        <w:t>ip-10-0-12-184.ec2.internal   Ready    &lt;none&gt;   22h   v1.34.8-eks-3385e9b</w:t>
+      </w:r>
+    </w:p>
+    <w:p/>
+    <w:p>
+      <w:r>
+        <w:t>Administrator@DESKTOP-FCQQ0BG MINGW64 /c/devops4sure520/Stack-Microsvc-K8s_Helm_ArgoCD_GitOps/kubedefs/platform/KARPENTER_k8s-manifests/17_02_Karpenter_On-demand_Instances (main)</w:t>
+      </w:r>
+    </w:p>
+    <w:p>
+      <w:r>
+        <w:t xml:space="preserve">$ </w:t>
+      </w:r>
+      <w:proofErr w:type="spellStart"/>
+      <w:r>
+        <w:t>kubectl</w:t>
+      </w:r>
+      <w:proofErr w:type="spellEnd"/>
+      <w:r>
+        <w:t xml:space="preserve"> get </w:t>
+      </w:r>
+      <w:proofErr w:type="spellStart"/>
+      <w:r>
+        <w:t>nodeclaims</w:t>
+      </w:r>
+      <w:proofErr w:type="spellEnd"/>
+    </w:p>
+    <w:p>
+      <w:r>
+        <w:t>No resources found</w:t>
+      </w:r>
+    </w:p>
+    <w:p/>
+    <w:p>
+      <w:r>
+        <w:t>Administrator@DESKTOP-FCQQ0BG MINGW64 /c/devops4sure520/Stack-Microsvc-K8s_Helm_ArgoCD_GitOps/kubedefs/platform/KARPENTER_k8s-manifests/17_02_Karpenter_On-demand_Instances (main)</w:t>
+      </w:r>
+    </w:p>
+    <w:p>
+      <w:r>
+        <w:t>$</w:t>
       </w:r>
     </w:p>
     <w:sectPr>

</xml_diff>